<commit_message>
Labb 1 del 1 och 2 klar
</commit_message>
<xml_diff>
--- a/Dokumentation/lab1-arbetsdokument.docx
+++ b/Dokumentation/lab1-arbetsdokument.docx
@@ -4,7 +4,7 @@
   <w:body>
     <w:p>
       <w:pPr>
-        <w:pStyle w:val="159"/>
+        <w:pStyle w:val="848"/>
         <w:pBdr/>
         <w:spacing/>
         <w:ind/>
@@ -19,7 +19,12 @@
         </w:rPr>
         <w:t xml:space="preserve">Labb 1 Rapport Arbetsdokument</w:t>
       </w:r>
-      <w:r/>
+      <w:r>
+        <w:rPr>
+          <w:highlight w:val="none"/>
+          <w:lang w:val="sv-SE"/>
+        </w:rPr>
+      </w:r>
     </w:p>
     <w:p>
       <w:pPr>
@@ -67,7 +72,12 @@
         </w:rPr>
         <w:t xml:space="preserve">Del 1:</w:t>
       </w:r>
-      <w:r/>
+      <w:r>
+        <w:rPr>
+          <w:highlight w:val="none"/>
+          <w:lang w:val="sv-SE"/>
+        </w:rPr>
+      </w:r>
     </w:p>
     <w:p>
       <w:pPr>
@@ -85,6 +95,12 @@
           <w:lang w:val="sv-SE"/>
         </w:rPr>
         <w:t xml:space="preserve">”Dokumentera minst 5 standardregler du hittar och beskriv vad de detekterar”</w:t>
+      </w:r>
+      <w:r>
+        <w:rPr>
+          <w:highlight w:val="none"/>
+          <w:lang w:val="sv-SE"/>
+        </w:rPr>
       </w:r>
       <w:r>
         <w:rPr>
@@ -129,6 +145,11 @@
           <w:highlight w:val="none"/>
         </w:rPr>
       </w:r>
+      <w:r>
+        <w:rPr>
+          <w:highlight w:val="none"/>
+        </w:rPr>
+      </w:r>
     </w:p>
     <w:p>
       <w:pPr>
@@ -163,12 +184,12 @@
       <w:r>
         <w:rPr>
           <w:highlight w:val="none"/>
-          <w:lang w:val="sv-SE"/>
         </w:rPr>
       </w:r>
       <w:r>
         <w:rPr>
           <w:highlight w:val="none"/>
+          <w:lang w:val="sv-SE"/>
         </w:rPr>
       </w:r>
     </w:p>
@@ -192,18 +213,12 @@
       <w:r>
         <w:rPr>
           <w:highlight w:val="none"/>
-          <w:lang w:val="sv-SE"/>
         </w:rPr>
       </w:r>
       <w:r>
         <w:rPr>
           <w:highlight w:val="none"/>
           <w:lang w:val="sv-SE"/>
-        </w:rPr>
-      </w:r>
-      <w:r>
-        <w:rPr>
-          <w:highlight w:val="none"/>
         </w:rPr>
       </w:r>
     </w:p>
@@ -235,10 +250,15 @@
           <w:lang w:val="sv-SE"/>
         </w:rPr>
       </w:r>
+      <w:r>
+        <w:rPr>
+          <w:highlight w:val="none"/>
+        </w:rPr>
+      </w:r>
     </w:p>
     <w:p>
       <w:pPr>
-        <w:pStyle w:val="668"/>
+        <w:pStyle w:val="892"/>
         <w:numPr>
           <w:ilvl w:val="0"/>
           <w:numId w:val="1"/>
@@ -267,7 +287,21 @@
         <w:br/>
         <w:t xml:space="preserve">if_sid: 52500</w:t>
         <w:br/>
-        <w:t xml:space="preserve">Den här regeln triggas om ett virus hittas av ClamAV. Andra antivirusprogram har liknande alerts, även om de fungerar väldigt olika. Windows Defender har till exempel regel 62123 som säger ”Windows Defender: Antimalware platform detected $(win.eventdata.severityName) potentially unwanted software ($(win.eventdata.processName))”, vilket är en mer dynamisk beskrivning än ClamAVs ”vi har hittat ett virus”.</w:t>
+        <w:t xml:space="preserve">Den här regeln triggas om ett viru</w:t>
+      </w:r>
+      <w:r>
+        <w:rPr>
+          <w:highlight w:val="none"/>
+          <w:lang w:val="sv-SE"/>
+        </w:rPr>
+        <w:t xml:space="preserve">s hittas av ClamAV. Andra antivirusprogram har liknande alerts, även om de fungerar väldigt olika. Windows Defender har till exempel regel 62123 som säger ”Windows Defender: Antimalware platform detected $(win.eventdata.severityName) potentially unwanted s</w:t>
+      </w:r>
+      <w:r>
+        <w:rPr>
+          <w:highlight w:val="none"/>
+          <w:lang w:val="sv-SE"/>
+        </w:rPr>
+        <w:t xml:space="preserve">oftware ($(win.eventdata.processName))”, vilket är en mer dynamisk beskrivning än ClamAVs ”vi har hittat ett virus”.</w:t>
         <w:br/>
         <w:t xml:space="preserve">Regeln har en ”if_sid”-tagg (iif sibling ID) för regel 52500. Det innebär att regel 52502 inte kommer triggas om inte 52500 triggas först.</w:t>
         <w:br/>
@@ -276,7 +310,7 @@
     </w:p>
     <w:p>
       <w:pPr>
-        <w:pStyle w:val="668"/>
+        <w:pStyle w:val="892"/>
         <w:numPr>
           <w:ilvl w:val="0"/>
           <w:numId w:val="1"/>
@@ -303,9 +337,23 @@
         <w:br/>
         <w:t xml:space="preserve">Hotnivå: 12</w:t>
         <w:br/>
-        <w:t xml:space="preserve">Den här regeln hör ihop med den föregående men triggas av att systemet får åtta loggar om att virus har hittats inom en tidsrymd av 360 sekunder. Med andra ord: varje virus som upptäcks triggar regel 52502, och när det har hänt åtta gånger inom 6 minuter kommer regel 40113 triggas.</w:t>
+        <w:t xml:space="preserve">Den här regeln hör ihop med den föregående men trigga</w:t>
+      </w:r>
+      <w:r>
+        <w:rPr>
+          <w:highlight w:val="none"/>
+          <w:lang w:val="sv-SE"/>
+        </w:rPr>
+        <w:t xml:space="preserve">s av att systemet får åtta loggar om att virus har hittats inom en tidsrymd av 360 sekunder. Med andra ord: varje virus som upptäcks triggar regel 52502, och när det har hänt åtta gånger inom 6 minuter kommer regel 40113 triggas.</w:t>
         <w:br/>
-        <w:t xml:space="preserve">Regel 40113 innebär med stor sannolikhet att det är ett virusutbrott eller någon form av malware-attack som måste hanteras omedelbart.</w:t>
+        <w:t xml:space="preserve">Regel 40113 innebär med st</w:t>
+      </w:r>
+      <w:r>
+        <w:rPr>
+          <w:highlight w:val="none"/>
+          <w:lang w:val="sv-SE"/>
+        </w:rPr>
+        <w:t xml:space="preserve">or sannolikhet att det är ett virusutbrott eller någon form av malware-attack som måste hanteras omedelbart.</w:t>
         <w:br/>
         <w:t xml:space="preserve">Åtta gånger inom 360 sekunder är standard, men många organisationer vill säkerligen larma mycket tidigare, och då är det den här regeln de ändrar.</w:t>
         <w:br/>
@@ -314,7 +362,7 @@
     </w:p>
     <w:p>
       <w:pPr>
-        <w:pStyle w:val="668"/>
+        <w:pStyle w:val="892"/>
         <w:numPr>
           <w:ilvl w:val="0"/>
           <w:numId w:val="1"/>
@@ -331,7 +379,14 @@
         </w:rPr>
         <w:t xml:space="preserve">Regel 52500 från 0320-clam_av_rules.xml</w:t>
         <w:br/>
-        <w:t xml:space="preserve">”Clamd messages grouped”</w:t>
+        <w:t xml:space="preserve">”</w:t>
+      </w:r>
+      <w:r>
+        <w:rPr>
+          <w:highlight w:val="none"/>
+          <w:lang w:val="sv-SE"/>
+        </w:rPr>
+        <w:t xml:space="preserve">Clamd messages grouped”</w:t>
         <w:br/>
         <w:t xml:space="preserve">Hotnivå: 0</w:t>
         <w:br/>
@@ -342,9 +397,23 @@
           <w:highlight w:val="none"/>
           <w:lang w:val="sv-SE"/>
         </w:rPr>
-        <w:t xml:space="preserve"> Wazuh läser av att loggen kommer från ”clamd” och matchar den med 52500. Sedan läser (till exempel) regel 52502 av loggen och letar efter specifika ord, som ”virus”. Då vet regel 52502 att loggen ska dit.</w:t>
+        <w:t xml:space="preserve"> Wazuh läser av att loggen kommer från ”clamd” och matchar </w:t>
+      </w:r>
+      <w:r>
+        <w:rPr>
+          <w:highlight w:val="none"/>
+          <w:lang w:val="sv-SE"/>
+        </w:rPr>
+        <w:t xml:space="preserve">den med 52500. Sedan läser (till exempel) regel 52502 av loggen och letar efter specifika ord, som ”virus”. Då vet regel 52502 att loggen ska dit.</w:t>
         <w:br/>
-        <w:t xml:space="preserve">Om en logg innehåller ordet ”virus” men kommer från en tjänst som inte är clamd, så kommer 52500 att ignorera loggen, och den går då någon annanstans.</w:t>
+        <w:t xml:space="preserve">Om en logg innehåller ordet ”virus” men kommer från en tjänst som inte är clamd, så kommer 52500 att ignorera</w:t>
+      </w:r>
+      <w:r>
+        <w:rPr>
+          <w:highlight w:val="none"/>
+          <w:lang w:val="sv-SE"/>
+        </w:rPr>
+        <w:t xml:space="preserve"> loggen, och den går då någon annanstans.</w:t>
         <w:br/>
         <w:t xml:space="preserve">Regelfilerna innehåller flera liknande regler med hotnivå 0 som är till för att snabba upp processen och skicka loggar rätt. Det går mycket snabbare att först hitta en kategori, och sen rätt regel i den kategorin.</w:t>
         <w:br/>
@@ -353,7 +422,7 @@
     </w:p>
     <w:p>
       <w:pPr>
-        <w:pStyle w:val="668"/>
+        <w:pStyle w:val="892"/>
         <w:numPr>
           <w:ilvl w:val="0"/>
           <w:numId w:val="1"/>
@@ -382,7 +451,14 @@
         <w:br/>
         <w:t xml:space="preserve">if_sid: 5700</w:t>
         <w:br/>
-        <w:t xml:space="preserve">Regeln talar om att någon har autentiserat sig via SSH. Huvudregeln som skickar vidare loggen till 5715 är 5700, som hanterar alla SSH-loggar.</w:t>
+        <w:t xml:space="preserve">Regeln talar om att någon har autentiserat sig via SSH.</w:t>
+      </w:r>
+      <w:r>
+        <w:rPr>
+          <w:highlight w:val="none"/>
+          <w:lang w:val="sv-SE"/>
+        </w:rPr>
+        <w:t xml:space="preserve"> Huvudregeln som skickar vidare loggen till 5715 är 5700, som hanterar alla SSH-loggar.</w:t>
         <w:br/>
         <w:t xml:space="preserve">Hotnivån är 3 och inte lägre för att det alltid finns en risk att en hotaktör har fått tag på inloggningsuppgifter, eller att inloggningen inte är tillräckligt härdad.</w:t>
         <w:br/>
@@ -391,7 +467,7 @@
     </w:p>
     <w:p>
       <w:pPr>
-        <w:pStyle w:val="668"/>
+        <w:pStyle w:val="892"/>
         <w:numPr>
           <w:ilvl w:val="0"/>
           <w:numId w:val="1"/>
@@ -428,7 +504,7 @@
     </w:p>
     <w:p>
       <w:pPr>
-        <w:pStyle w:val="668"/>
+        <w:pStyle w:val="892"/>
         <w:numPr>
           <w:ilvl w:val="0"/>
           <w:numId w:val="1"/>
@@ -462,7 +538,7 @@
     </w:p>
     <w:p>
       <w:pPr>
-        <w:pStyle w:val="668"/>
+        <w:pStyle w:val="892"/>
         <w:numPr>
           <w:ilvl w:val="0"/>
           <w:numId w:val="1"/>
@@ -492,7 +568,21 @@
         <w:br/>
         <w:t xml:space="preserve">if_sid: 99503</w:t>
         <w:br/>
-        <w:t xml:space="preserve">Om den här regeln triggas har systemet fått en rapport/logg från Microsoft Graph (övervakar Microsoft 365 Cloud) till regel 99500. Därifrån skickades den vidare till antingen 99501 eller 99502 beroende på om det är en händelse eller flera. Därefter kommer den till 99503 som kollar om den är löst eller inte. Är den löst slängs den och ingenting mer händer. Men är den inte löst går den vidare, och då kan 99614 plocka upp den.</w:t>
+        <w:t xml:space="preserve">Om den här regeln triggas har systemet fått en rapport/logg f</w:t>
+      </w:r>
+      <w:r>
+        <w:rPr>
+          <w:highlight w:val="none"/>
+          <w:lang w:val="sv-SE"/>
+        </w:rPr>
+        <w:t xml:space="preserve">rån Microsoft Graph (övervakar Microsoft 365 Cloud) till regel 99500. Därifrån skickades den vidare till antingen 99501 eller 99502 beroende på om det är en händelse eller flera. Därefter kommer den till 99503 som kollar om den är löst eller inte. Är den l</w:t>
+      </w:r>
+      <w:r>
+        <w:rPr>
+          <w:highlight w:val="none"/>
+          <w:lang w:val="sv-SE"/>
+        </w:rPr>
+        <w:t xml:space="preserve">öst slängs den och ingenting mer händer. Men är den inte löst går den vidare, och då kan 99614 plocka upp den.</w:t>
         <w:br/>
         <w:t xml:space="preserve">Hotnivån är 15, så hög den kan bli. Användarkontot som triggat regeln måste inaktiveras och alla aktiva anslutningar till kontot måste avslutas.</w:t>
         <w:br/>
@@ -502,10 +592,393 @@
     <w:p>
       <w:pPr>
         <w:pBdr/>
+        <w:shd w:val="nil" w:color="auto"/>
+        <w:spacing/>
+        <w:ind/>
+        <w:rPr/>
+      </w:pPr>
+      <w:r>
+        <w:rPr>
+          <w:highlight w:val="none"/>
+          <w:lang w:val="sv-SE"/>
+        </w:rPr>
+        <w:br w:type="page" w:clear="all"/>
+      </w:r>
+      <w:r>
+        <w:rPr>
+          <w:highlight w:val="none"/>
+          <w:lang w:val="sv-SE"/>
+        </w:rPr>
+      </w:r>
+      <w:r/>
+    </w:p>
+    <w:p>
+      <w:pPr>
+        <w:pStyle w:val="892"/>
+        <w:numPr>
+          <w:ilvl w:val="0"/>
+          <w:numId w:val="1"/>
+        </w:numPr>
+        <w:pBdr/>
+        <w:spacing/>
+        <w:ind/>
+        <w:rPr/>
+      </w:pPr>
+      <w:r>
+        <w:rPr>
+          <w:highlight w:val="none"/>
+          <w:lang w:val="sv-SE"/>
+        </w:rPr>
+      </w:r>
+      <w:r>
+        <w:rPr>
+          <w:highlight w:val="none"/>
+          <w:lang w:val="sv-SE"/>
+        </w:rPr>
+        <w:t xml:space="preserve">Regel 92060 från 0800-sysmon_id_1.xml</w:t>
+        <w:br/>
+        <w:t xml:space="preserve">”Suspicious process ( right to left override character ) spawned a subprocess”</w:t>
+        <w:br/>
+        <w:t xml:space="preserve">Hotnivå: 15</w:t>
+        <w:br/>
+        <w:t xml:space="preserve">Sysmon (System Moni</w:t>
+      </w:r>
+      <w:r>
+        <w:rPr>
+          <w:highlight w:val="none"/>
+          <w:lang w:val="sv-SE"/>
+        </w:rPr>
+        <w:t xml:space="preserve">tor) är ett verktyg som övervakar Windows-maskiner. Filen 0800-sysmon_id_1.xml övervakar skapandet av processer. Om regel 92060 har triggats så misstänker systemet att någon har bytt namn på en fil från till exempel ”fil_txt.exe” till ”fil_exe.txt” genom a</w:t>
+      </w:r>
+      <w:r>
+        <w:rPr>
+          <w:highlight w:val="none"/>
+          <w:lang w:val="sv-SE"/>
+        </w:rPr>
+        <w:t xml:space="preserve">tt skriva de sista tecknen från höger till vänster. Systemet ser fortsatt att filen heter ”fil_text.exe”, men för en användare ser det ut som en textfil med namnet ”fil_exe.txt”. Regeln triggas bara om någon försöker öppna filen och den startar en process.</w:t>
+      </w:r>
+      <w:r>
+        <w:rPr>
+          <w:highlight w:val="none"/>
+          <w:lang w:val="sv-SE"/>
+        </w:rPr>
+      </w:r>
+      <w:r/>
+    </w:p>
+    <w:p>
+      <w:pPr>
+        <w:pBdr/>
         <w:shd w:val="nil"/>
         <w:spacing/>
         <w:ind/>
         <w:rPr/>
+      </w:pPr>
+      <w:r>
+        <w:br w:type="page" w:clear="all"/>
+      </w:r>
+      <w:r/>
+      <w:r/>
+    </w:p>
+    <w:p>
+      <w:pPr>
+        <w:pBdr/>
+        <w:spacing/>
+        <w:ind w:firstLine="0" w:left="0"/>
+        <w:rPr>
+          <w:highlight w:val="none"/>
+          <w:lang w:val="sv-SE"/>
+        </w:rPr>
+      </w:pPr>
+      <w:r>
+        <w:rPr>
+          <w:highlight w:val="none"/>
+          <w:lang w:val="sv-SE"/>
+        </w:rPr>
+        <w:t xml:space="preserve">”Skapa en Wazuh dashboard och ta en skärmdump på den när den är klar”</w:t>
+      </w:r>
+      <w:r/>
+    </w:p>
+    <w:p>
+      <w:pPr>
+        <w:pBdr/>
+        <w:spacing/>
+        <w:ind w:firstLine="0" w:left="0"/>
+        <w:rPr>
+          <w:highlight w:val="none"/>
+          <w:lang w:val="sv-SE"/>
+        </w:rPr>
+      </w:pPr>
+      <w:r>
+        <w:rPr>
+          <w:highlight w:val="none"/>
+          <w:lang w:val="sv-SE"/>
+        </w:rPr>
+      </w:r>
+      <w:r>
+        <mc:AlternateContent>
+          <mc:Choice Requires="wpg">
+            <w:drawing>
+              <wp:inline xmlns:wp="http://schemas.openxmlformats.org/drawingml/2006/wordprocessingDrawing" distT="0" distB="0" distL="0" distR="0">
+                <wp:extent cx="5940425" cy="2950028"/>
+                <wp:effectExtent l="0" t="0" r="0" b="0"/>
+                <wp:docPr id="1" name=""/>
+                <wp:cNvGraphicFramePr>
+                  <a:graphicFrameLocks xmlns:a="http://schemas.openxmlformats.org/drawingml/2006/main" noChangeAspect="1"/>
+                </wp:cNvGraphicFramePr>
+                <a:graphic xmlns:a="http://schemas.openxmlformats.org/drawingml/2006/main">
+                  <a:graphicData uri="http://schemas.openxmlformats.org/drawingml/2006/picture">
+                    <pic:pic xmlns:pic="http://schemas.openxmlformats.org/drawingml/2006/picture">
+                      <pic:nvPicPr>
+                        <pic:cNvPr id="226620292" name=""/>
+                        <pic:cNvPicPr>
+                          <a:picLocks noChangeAspect="1"/>
+                        </pic:cNvPicPr>
+                        <pic:nvPr/>
+                      </pic:nvPicPr>
+                      <pic:blipFill rotWithShape="1">
+                        <a:blip r:embed="rId9"/>
+                        <a:stretch/>
+                      </pic:blipFill>
+                      <pic:spPr bwMode="auto">
+                        <a:xfrm>
+                          <a:off x="0" y="0"/>
+                          <a:ext cx="5940424" cy="2950027"/>
+                        </a:xfrm>
+                        <a:prstGeom prst="rect">
+                          <a:avLst/>
+                        </a:prstGeom>
+                      </pic:spPr>
+                    </pic:pic>
+                  </a:graphicData>
+                </a:graphic>
+              </wp:inline>
+            </w:drawing>
+          </mc:Choice>
+          <mc:Fallback>
+            <w:pict>
+              <v:shapetype id="_x0000_t75" coordsize="21600,21600" o:spt="75" o:preferrelative="t" path="m@4@5l@4@11@9@11@9@5xe" filled="f" stroked="f">
+                <v:stroke joinstyle="miter"/>
+                <v:formulas>
+                  <v:f eqn="if lineDrawn pixelLineWidth 0"/>
+                  <v:f eqn="sum @0 1 0"/>
+                  <v:f eqn="sum 0 0 @1"/>
+                  <v:f eqn="prod @2 1 2"/>
+                  <v:f eqn="prod @3 21600 pixelWidth"/>
+                  <v:f eqn="prod @3 21600 pixelHeight"/>
+                  <v:f eqn="sum @0 0 1"/>
+                  <v:f eqn="prod @6 1 2"/>
+                  <v:f eqn="prod @7 21600 pixelWidth"/>
+                  <v:f eqn="sum @8 21600 0"/>
+                  <v:f eqn="prod @7 21600 pixelHeight"/>
+                  <v:f eqn="sum @10 21600 0"/>
+                </v:formulas>
+                <v:path o:extrusionok="f" gradientshapeok="t" o:connecttype="rect"/>
+                <o:lock v:ext="edit" aspectratio="t"/>
+              </v:shapetype>
+              <v:shape id="_x0000_i0" o:spid="_x0000_s0" type="#_x0000_t75" style="width:467.75pt;height:232.29pt;mso-wrap-distance-left:0.00pt;mso-wrap-distance-top:0.00pt;mso-wrap-distance-right:0.00pt;mso-wrap-distance-bottom:0.00pt;z-index:1;" stroked="false">
+                <v:imagedata r:id="rId9" o:title=""/>
+                <o:lock v:ext="edit" rotation="t"/>
+              </v:shape>
+            </w:pict>
+          </mc:Fallback>
+        </mc:AlternateContent>
+      </w:r>
+      <w:r>
+        <w:rPr>
+          <w:highlight w:val="none"/>
+          <w:lang w:val="sv-SE"/>
+        </w:rPr>
+      </w:r>
+      <w:r/>
+      <w:r>
+        <w:rPr>
+          <w:highlight w:val="none"/>
+          <w:lang w:val="sv-SE"/>
+        </w:rPr>
+      </w:r>
+      <w:r>
+        <w:rPr>
+          <w:highlight w:val="none"/>
+          <w:lang w:val="sv-SE"/>
+        </w:rPr>
+      </w:r>
+      <w:r/>
+    </w:p>
+    <w:p>
+      <w:pPr>
+        <w:pBdr/>
+        <w:spacing/>
+        <w:ind w:firstLine="0" w:left="0"/>
+        <w:rPr>
+          <w:highlight w:val="none"/>
+          <w:lang w:val="sv-SE"/>
+        </w:rPr>
+      </w:pPr>
+      <w:r>
+        <w:rPr>
+          <w:highlight w:val="none"/>
+          <w:lang w:val="sv-SE"/>
+        </w:rPr>
+        <w:t xml:space="preserve">”Dokumentera vilka larm som utlöstes, hur lång tid det tog, och vilka attacker som missades”</w:t>
+      </w:r>
+      <w:r/>
+    </w:p>
+    <w:p>
+      <w:pPr>
+        <w:pBdr/>
+        <w:spacing/>
+        <w:ind w:firstLine="0" w:left="0"/>
+        <w:rPr>
+          <w:highlight w:val="none"/>
+          <w:lang w:val="sv-SE"/>
+        </w:rPr>
+      </w:pPr>
+      <w:r>
+        <w:rPr>
+          <w:highlight w:val="none"/>
+          <w:lang w:val="sv-SE"/>
+        </w:rPr>
+        <w:t xml:space="preserve">Jag tror inte några attacker missades. Även om reglerna vi skrivit in själva inte tar allt så är fortfarande standardreglerna aktiva. Jag kunde inte se hur lång tid det tog.</w:t>
+        <w:br/>
+        <w:t xml:space="preserve">Några av reglerna som utlöstes:</w:t>
+        <w:br/>
+        <w:t xml:space="preserve">651: Host blocked by firewall-drop</w:t>
+        <w:br/>
+        <w:t xml:space="preserve">5710: Attempt to login using a non-existent user</w:t>
+        <w:br/>
+        <w:t xml:space="preserve">5503: User login failed</w:t>
+        <w:br/>
+        <w:t xml:space="preserve">5712: brute force trying to get access to the system</w:t>
+        <w:br/>
+        <w:t xml:space="preserve">5551: Multiple failed logins in a small period of time</w:t>
+        <w:br/>
+        <w:t xml:space="preserve">5557: Password check failed</w:t>
+        <w:br/>
+        <w:t xml:space="preserve">100001: SSH brute force-attack detected (5+ failed attempts)</w:t>
+        <w:br/>
+        <w:t xml:space="preserve">2501: User authentication failure</w:t>
+        <w:br/>
+        <w:t xml:space="preserve">5760: authentication failed</w:t>
+        <w:br/>
+        <w:t xml:space="preserve">652: Host Unblocked by firewall-drop (efter 10 minuter)</w:t>
+      </w:r>
+      <w:r/>
+    </w:p>
+    <w:p>
+      <w:pPr>
+        <w:pBdr/>
+        <w:spacing/>
+        <w:ind w:firstLine="0" w:left="0"/>
+        <w:jc w:val="center"/>
+        <w:rPr>
+          <w:highlight w:val="none"/>
+          <w:lang w:val="sv-SE"/>
+        </w:rPr>
+      </w:pPr>
+      <w:r>
+        <w:rPr>
+          <w:highlight w:val="none"/>
+          <w:lang w:val="sv-SE"/>
+        </w:rPr>
+      </w:r>
+      <w:r>
+        <mc:AlternateContent>
+          <mc:Choice Requires="wpg">
+            <w:drawing>
+              <wp:inline xmlns:wp="http://schemas.openxmlformats.org/drawingml/2006/wordprocessingDrawing" distT="0" distB="0" distL="0" distR="0">
+                <wp:extent cx="5407365" cy="2959729"/>
+                <wp:effectExtent l="0" t="0" r="0" b="0"/>
+                <wp:docPr id="2" name=""/>
+                <wp:cNvGraphicFramePr>
+                  <a:graphicFrameLocks xmlns:a="http://schemas.openxmlformats.org/drawingml/2006/main" noChangeAspect="1"/>
+                </wp:cNvGraphicFramePr>
+                <a:graphic xmlns:a="http://schemas.openxmlformats.org/drawingml/2006/main">
+                  <a:graphicData uri="http://schemas.openxmlformats.org/drawingml/2006/picture">
+                    <pic:pic xmlns:pic="http://schemas.openxmlformats.org/drawingml/2006/picture">
+                      <pic:nvPicPr>
+                        <pic:cNvPr id="744555511" name=""/>
+                        <pic:cNvPicPr>
+                          <a:picLocks noChangeAspect="1"/>
+                        </pic:cNvPicPr>
+                        <pic:nvPr/>
+                      </pic:nvPicPr>
+                      <pic:blipFill rotWithShape="1">
+                        <a:blip r:embed="rId10"/>
+                        <a:stretch/>
+                      </pic:blipFill>
+                      <pic:spPr bwMode="auto">
+                        <a:xfrm flipH="0" flipV="0">
+                          <a:off x="0" y="0"/>
+                          <a:ext cx="5407364" cy="2959729"/>
+                        </a:xfrm>
+                        <a:prstGeom prst="rect">
+                          <a:avLst/>
+                        </a:prstGeom>
+                      </pic:spPr>
+                    </pic:pic>
+                  </a:graphicData>
+                </a:graphic>
+              </wp:inline>
+            </w:drawing>
+          </mc:Choice>
+          <mc:Fallback>
+            <w:pict>
+              <v:shapetype id="_x0000_t75" coordsize="21600,21600" o:spt="75" o:preferrelative="t" path="m@4@5l@4@11@9@11@9@5xe" filled="f" stroked="f">
+                <v:stroke joinstyle="miter"/>
+                <v:formulas>
+                  <v:f eqn="if lineDrawn pixelLineWidth 0"/>
+                  <v:f eqn="sum @0 1 0"/>
+                  <v:f eqn="sum 0 0 @1"/>
+                  <v:f eqn="prod @2 1 2"/>
+                  <v:f eqn="prod @3 21600 pixelWidth"/>
+                  <v:f eqn="prod @3 21600 pixelHeight"/>
+                  <v:f eqn="sum @0 0 1"/>
+                  <v:f eqn="prod @6 1 2"/>
+                  <v:f eqn="prod @7 21600 pixelWidth"/>
+                  <v:f eqn="sum @8 21600 0"/>
+                  <v:f eqn="prod @7 21600 pixelHeight"/>
+                  <v:f eqn="sum @10 21600 0"/>
+                </v:formulas>
+                <v:path o:extrusionok="f" gradientshapeok="t" o:connecttype="rect"/>
+                <o:lock v:ext="edit" aspectratio="t"/>
+              </v:shapetype>
+              <v:shape id="_x0000_i1" o:spid="_x0000_s1" type="#_x0000_t75" style="width:425.78pt;height:233.05pt;mso-wrap-distance-left:0.00pt;mso-wrap-distance-top:0.00pt;mso-wrap-distance-right:0.00pt;mso-wrap-distance-bottom:0.00pt;z-index:1;" stroked="false">
+                <v:imagedata r:id="rId10" o:title=""/>
+                <o:lock v:ext="edit" rotation="t"/>
+              </v:shape>
+            </w:pict>
+          </mc:Fallback>
+        </mc:AlternateContent>
+      </w:r>
+      <w:r>
+        <w:rPr>
+          <w:highlight w:val="none"/>
+          <w:lang w:val="sv-SE"/>
+        </w:rPr>
+      </w:r>
+      <w:r>
+        <w:rPr>
+          <w:highlight w:val="none"/>
+          <w:lang w:val="sv-SE"/>
+        </w:rPr>
+      </w:r>
+      <w:r>
+        <w:rPr>
+          <w:highlight w:val="none"/>
+          <w:lang w:val="sv-SE"/>
+        </w:rPr>
+      </w:r>
+    </w:p>
+    <w:p>
+      <w:pPr>
+        <w:pBdr/>
+        <w:shd w:val="nil"/>
+        <w:spacing/>
+        <w:ind/>
+        <w:rPr>
+          <w:highlight w:val="none"/>
+          <w:lang w:val="sv-SE"/>
+        </w:rPr>
       </w:pPr>
       <w:r>
         <w:rPr>
@@ -526,19 +999,18 @@
           <w:lang w:val="sv-SE"/>
         </w:rPr>
       </w:r>
-    </w:p>
-    <w:p>
-      <w:pPr>
-        <w:pStyle w:val="668"/>
-        <w:numPr>
-          <w:ilvl w:val="0"/>
-          <w:numId w:val="1"/>
-        </w:numPr>
-        <w:pBdr/>
-        <w:spacing/>
-        <w:ind/>
-        <w:rPr/>
-      </w:pPr>
+      <w:r>
+        <w:rPr>
+          <w:highlight w:val="none"/>
+          <w:lang w:val="sv-SE" w:bidi="sv-SE"/>
+        </w:rPr>
+      </w:r>
+      <w:r>
+        <w:rPr>
+          <w:highlight w:val="none"/>
+          <w:lang w:val="sv-SE" w:bidi="sv-SE"/>
+        </w:rPr>
+      </w:r>
       <w:r>
         <w:rPr>
           <w:highlight w:val="none"/>
@@ -550,13 +1022,24 @@
           <w:highlight w:val="none"/>
           <w:lang w:val="sv-SE"/>
         </w:rPr>
-        <w:t xml:space="preserve">Regel 92060 från 0800-sysmon_id_1.xml</w:t>
-        <w:br/>
-        <w:t xml:space="preserve">”Suspicious process ( right to left override character ) spawned a subprocess”</w:t>
-        <w:br/>
-        <w:t xml:space="preserve">Hotnivå: 15</w:t>
-        <w:br/>
-        <w:t xml:space="preserve">Sysmon (System Monitor) är ett verktyg som övervakar Windows-maskiner. Filen 0800-sysmon_id_1.xml övervakar skapandet av processer. Om regel 92060 har triggats så misstänker systemet att någon har bytt namn på en fil från till exempel ”fil_txt.exe” till ”fil_exe.txt” genom att skriva de sista tecknen från höger till vänster. Systemet ser fortsatt att filen heter ”fil_text.exe”, men för en användare ser det ut som en textfil med namnet ”fil_exe.txt”. Regeln triggas bara om någon försöker öppna filen och den startar en process.</w:t>
+      </w:r>
+      <w:r>
+        <w:rPr>
+          <w:highlight w:val="none"/>
+          <w:lang w:val="sv-SE"/>
+        </w:rPr>
+      </w:r>
+      <w:r>
+        <w:rPr>
+          <w:highlight w:val="none"/>
+          <w:lang w:val="sv-SE"/>
+        </w:rPr>
+      </w:r>
+      <w:r>
+        <w:rPr>
+          <w:highlight w:val="none"/>
+          <w:lang w:val="sv-SE"/>
+        </w:rPr>
       </w:r>
       <w:r>
         <w:rPr>
@@ -587,7 +1070,6 @@
         <w:ind/>
         <w:rPr/>
       </w:pPr>
-      <w:r/>
       <w:r>
         <w:separator/>
       </w:r>
@@ -602,7 +1084,6 @@
         <w:ind/>
         <w:rPr/>
       </w:pPr>
-      <w:r/>
       <w:r>
         <w:continuationSeparator/>
       </w:r>
@@ -622,7 +1103,6 @@
         <w:ind/>
         <w:rPr/>
       </w:pPr>
-      <w:r/>
       <w:r>
         <w:separator/>
       </w:r>
@@ -637,7 +1117,6 @@
         <w:ind/>
         <w:rPr/>
       </w:pPr>
-      <w:r/>
       <w:r>
         <w:continuationSeparator/>
       </w:r>
@@ -942,9 +1421,9 @@
     <w:lsdException w:name="Bibliography" w:uiPriority="37"/>
     <w:lsdException w:name="TOC Heading" w:uiPriority="39" w:qFormat="1"/>
   </w:latentStyles>
-  <w:style w:type="table" w:styleId="12">
+  <w:style w:type="table" w:styleId="703">
     <w:name w:val="Table Grid"/>
-    <w:basedOn w:val="665"/>
+    <w:basedOn w:val="889"/>
     <w:uiPriority w:val="59"/>
     <w:pPr>
       <w:pBdr/>
@@ -1141,9 +1620,9 @@
       </w:tcPr>
     </w:tblStylePr>
   </w:style>
-  <w:style w:type="table" w:styleId="13">
+  <w:style w:type="table" w:styleId="704">
     <w:name w:val="Table Grid Light"/>
-    <w:basedOn w:val="665"/>
+    <w:basedOn w:val="889"/>
     <w:uiPriority w:val="59"/>
     <w:pPr>
       <w:pBdr/>
@@ -1340,9 +1819,9 @@
       </w:tcPr>
     </w:tblStylePr>
   </w:style>
-  <w:style w:type="table" w:styleId="14">
+  <w:style w:type="table" w:styleId="705">
     <w:name w:val="Plain Table 1"/>
-    <w:basedOn w:val="665"/>
+    <w:basedOn w:val="889"/>
     <w:uiPriority w:val="59"/>
     <w:pPr>
       <w:pBdr/>
@@ -1565,9 +2044,9 @@
       </w:tcPr>
     </w:tblStylePr>
   </w:style>
-  <w:style w:type="table" w:styleId="15">
+  <w:style w:type="table" w:styleId="706">
     <w:name w:val="Plain Table 2"/>
-    <w:basedOn w:val="665"/>
+    <w:basedOn w:val="889"/>
     <w:uiPriority w:val="59"/>
     <w:pPr>
       <w:pBdr/>
@@ -1798,9 +2277,9 @@
       </w:tcPr>
     </w:tblStylePr>
   </w:style>
-  <w:style w:type="table" w:styleId="16">
+  <w:style w:type="table" w:styleId="707">
     <w:name w:val="Plain Table 3"/>
-    <w:basedOn w:val="665"/>
+    <w:basedOn w:val="889"/>
     <w:uiPriority w:val="99"/>
     <w:pPr>
       <w:pBdr/>
@@ -2028,9 +2507,9 @@
       </w:tcPr>
     </w:tblStylePr>
   </w:style>
-  <w:style w:type="table" w:styleId="17">
+  <w:style w:type="table" w:styleId="708">
     <w:name w:val="Plain Table 4"/>
-    <w:basedOn w:val="665"/>
+    <w:basedOn w:val="889"/>
     <w:uiPriority w:val="99"/>
     <w:pPr>
       <w:pBdr/>
@@ -2244,9 +2723,9 @@
       </w:tcPr>
     </w:tblStylePr>
   </w:style>
-  <w:style w:type="table" w:styleId="18">
+  <w:style w:type="table" w:styleId="709">
     <w:name w:val="Plain Table 5"/>
-    <w:basedOn w:val="665"/>
+    <w:basedOn w:val="889"/>
     <w:uiPriority w:val="99"/>
     <w:pPr>
       <w:pBdr/>
@@ -2477,9 +2956,9 @@
       </w:tcPr>
     </w:tblStylePr>
   </w:style>
-  <w:style w:type="table" w:styleId="19">
+  <w:style w:type="table" w:styleId="710">
     <w:name w:val="Grid Table 1 Light"/>
-    <w:basedOn w:val="665"/>
+    <w:basedOn w:val="889"/>
     <w:uiPriority w:val="99"/>
     <w:pPr>
       <w:pBdr/>
@@ -2700,9 +3179,9 @@
       </w:tcPr>
     </w:tblStylePr>
   </w:style>
-  <w:style w:type="table" w:styleId="20">
+  <w:style w:type="table" w:styleId="711">
     <w:name w:val="Grid Table 1 Light - Accent 1"/>
-    <w:basedOn w:val="665"/>
+    <w:basedOn w:val="889"/>
     <w:uiPriority w:val="99"/>
     <w:pPr>
       <w:pBdr/>
@@ -2923,9 +3402,9 @@
       </w:tcPr>
     </w:tblStylePr>
   </w:style>
-  <w:style w:type="table" w:styleId="21">
+  <w:style w:type="table" w:styleId="712">
     <w:name w:val="Grid Table 1 Light - Accent 2"/>
-    <w:basedOn w:val="665"/>
+    <w:basedOn w:val="889"/>
     <w:uiPriority w:val="99"/>
     <w:pPr>
       <w:pBdr/>
@@ -3146,9 +3625,9 @@
       </w:tcPr>
     </w:tblStylePr>
   </w:style>
-  <w:style w:type="table" w:styleId="22">
+  <w:style w:type="table" w:styleId="713">
     <w:name w:val="Grid Table 1 Light - Accent 3"/>
-    <w:basedOn w:val="665"/>
+    <w:basedOn w:val="889"/>
     <w:uiPriority w:val="99"/>
     <w:pPr>
       <w:pBdr/>
@@ -3369,9 +3848,9 @@
       </w:tcPr>
     </w:tblStylePr>
   </w:style>
-  <w:style w:type="table" w:styleId="23">
+  <w:style w:type="table" w:styleId="714">
     <w:name w:val="Grid Table 1 Light - Accent 4"/>
-    <w:basedOn w:val="665"/>
+    <w:basedOn w:val="889"/>
     <w:uiPriority w:val="99"/>
     <w:pPr>
       <w:pBdr/>
@@ -3592,9 +4071,9 @@
       </w:tcPr>
     </w:tblStylePr>
   </w:style>
-  <w:style w:type="table" w:styleId="24">
+  <w:style w:type="table" w:styleId="715">
     <w:name w:val="Grid Table 1 Light - Accent 5"/>
-    <w:basedOn w:val="665"/>
+    <w:basedOn w:val="889"/>
     <w:uiPriority w:val="99"/>
     <w:pPr>
       <w:pBdr/>
@@ -3815,9 +4294,9 @@
       </w:tcPr>
     </w:tblStylePr>
   </w:style>
-  <w:style w:type="table" w:styleId="25">
+  <w:style w:type="table" w:styleId="716">
     <w:name w:val="Grid Table 1 Light - Accent 6"/>
-    <w:basedOn w:val="665"/>
+    <w:basedOn w:val="889"/>
     <w:uiPriority w:val="99"/>
     <w:pPr>
       <w:pBdr/>
@@ -4038,9 +4517,9 @@
       </w:tcPr>
     </w:tblStylePr>
   </w:style>
-  <w:style w:type="table" w:styleId="26">
+  <w:style w:type="table" w:styleId="717">
     <w:name w:val="Grid Table 2"/>
-    <w:basedOn w:val="665"/>
+    <w:basedOn w:val="889"/>
     <w:uiPriority w:val="99"/>
     <w:pPr>
       <w:pBdr/>
@@ -4270,9 +4749,9 @@
       </w:tcPr>
     </w:tblStylePr>
   </w:style>
-  <w:style w:type="table" w:styleId="27">
+  <w:style w:type="table" w:styleId="718">
     <w:name w:val="Grid Table 2 - Accent 1"/>
-    <w:basedOn w:val="665"/>
+    <w:basedOn w:val="889"/>
     <w:uiPriority w:val="99"/>
     <w:pPr>
       <w:pBdr/>
@@ -4502,9 +4981,9 @@
       </w:tcPr>
     </w:tblStylePr>
   </w:style>
-  <w:style w:type="table" w:styleId="28">
+  <w:style w:type="table" w:styleId="719">
     <w:name w:val="Grid Table 2 - Accent 2"/>
-    <w:basedOn w:val="665"/>
+    <w:basedOn w:val="889"/>
     <w:uiPriority w:val="99"/>
     <w:pPr>
       <w:pBdr/>
@@ -4734,9 +5213,9 @@
       </w:tcPr>
     </w:tblStylePr>
   </w:style>
-  <w:style w:type="table" w:styleId="29">
+  <w:style w:type="table" w:styleId="720">
     <w:name w:val="Grid Table 2 - Accent 3"/>
-    <w:basedOn w:val="665"/>
+    <w:basedOn w:val="889"/>
     <w:uiPriority w:val="99"/>
     <w:pPr>
       <w:pBdr/>
@@ -4966,9 +5445,9 @@
       </w:tcPr>
     </w:tblStylePr>
   </w:style>
-  <w:style w:type="table" w:styleId="30">
+  <w:style w:type="table" w:styleId="721">
     <w:name w:val="Grid Table 2 - Accent 4"/>
-    <w:basedOn w:val="665"/>
+    <w:basedOn w:val="889"/>
     <w:uiPriority w:val="99"/>
     <w:pPr>
       <w:pBdr/>
@@ -5198,9 +5677,9 @@
       </w:tcPr>
     </w:tblStylePr>
   </w:style>
-  <w:style w:type="table" w:styleId="31">
+  <w:style w:type="table" w:styleId="722">
     <w:name w:val="Grid Table 2 - Accent 5"/>
-    <w:basedOn w:val="665"/>
+    <w:basedOn w:val="889"/>
     <w:uiPriority w:val="99"/>
     <w:pPr>
       <w:pBdr/>
@@ -5430,9 +5909,9 @@
       </w:tcPr>
     </w:tblStylePr>
   </w:style>
-  <w:style w:type="table" w:styleId="32">
+  <w:style w:type="table" w:styleId="723">
     <w:name w:val="Grid Table 2 - Accent 6"/>
-    <w:basedOn w:val="665"/>
+    <w:basedOn w:val="889"/>
     <w:uiPriority w:val="99"/>
     <w:pPr>
       <w:pBdr/>
@@ -5662,9 +6141,9 @@
       </w:tcPr>
     </w:tblStylePr>
   </w:style>
-  <w:style w:type="table" w:styleId="33">
+  <w:style w:type="table" w:styleId="724">
     <w:name w:val="Grid Table 3"/>
-    <w:basedOn w:val="665"/>
+    <w:basedOn w:val="889"/>
     <w:uiPriority w:val="99"/>
     <w:pPr>
       <w:pBdr/>
@@ -5763,29 +6242,6 @@
         <w:tblBorders/>
       </w:tblPr>
       <w:tcPr>
-        <w:shd w:color="ffffff"/>
-        <w:tcBorders>
-          <w:top w:val="none" w:color="000000" w:sz="4" w:space="0"/>
-          <w:left w:val="none" w:color="000000" w:sz="4" w:space="0"/>
-          <w:bottom w:val="none" w:color="000000" w:sz="4" w:space="0"/>
-          <w:right w:val="none" w:color="000000" w:sz="4" w:space="0"/>
-        </w:tcBorders>
-      </w:tcPr>
-    </w:tblStylePr>
-    <w:tblStylePr w:type="firstRow">
-      <w:rPr>
-        <w:b/>
-        <w:color w:val="404040"/>
-      </w:rPr>
-      <w:pPr>
-        <w:pBdr/>
-        <w:spacing/>
-        <w:ind/>
-      </w:pPr>
-      <w:tblPr>
-        <w:tblBorders/>
-      </w:tblPr>
-      <w:tcPr>
         <w:shd w:val="clear" w:color="ffffff"/>
         <w:tcBorders>
           <w:top w:val="none" w:color="000000" w:sz="4" w:space="0"/>
@@ -5795,30 +6251,7 @@
         </w:tcBorders>
       </w:tcPr>
     </w:tblStylePr>
-    <w:tblStylePr w:type="lastCol">
-      <w:rPr>
-        <w:i/>
-        <w:color w:val="404040"/>
-      </w:rPr>
-      <w:pPr>
-        <w:pBdr/>
-        <w:spacing/>
-        <w:ind/>
-      </w:pPr>
-      <w:tblPr>
-        <w:tblBorders/>
-      </w:tblPr>
-      <w:tcPr>
-        <w:shd w:color="ffffff"/>
-        <w:tcBorders>
-          <w:top w:val="none" w:color="000000" w:sz="4" w:space="0"/>
-          <w:left w:val="none" w:color="000000" w:sz="4" w:space="0"/>
-          <w:bottom w:val="none" w:color="000000" w:sz="4" w:space="0"/>
-          <w:right w:val="none" w:color="000000" w:sz="4" w:space="0"/>
-        </w:tcBorders>
-      </w:tcPr>
-    </w:tblStylePr>
-    <w:tblStylePr w:type="lastRow">
+    <w:tblStylePr w:type="firstRow">
       <w:rPr>
         <w:b/>
         <w:color w:val="404040"/>
@@ -5841,6 +6274,52 @@
         </w:tcBorders>
       </w:tcPr>
     </w:tblStylePr>
+    <w:tblStylePr w:type="lastCol">
+      <w:rPr>
+        <w:i/>
+        <w:color w:val="404040"/>
+      </w:rPr>
+      <w:pPr>
+        <w:pBdr/>
+        <w:spacing/>
+        <w:ind/>
+      </w:pPr>
+      <w:tblPr>
+        <w:tblBorders/>
+      </w:tblPr>
+      <w:tcPr>
+        <w:shd w:val="clear" w:color="ffffff"/>
+        <w:tcBorders>
+          <w:top w:val="none" w:color="000000" w:sz="4" w:space="0"/>
+          <w:left w:val="none" w:color="000000" w:sz="4" w:space="0"/>
+          <w:bottom w:val="none" w:color="000000" w:sz="4" w:space="0"/>
+          <w:right w:val="none" w:color="000000" w:sz="4" w:space="0"/>
+        </w:tcBorders>
+      </w:tcPr>
+    </w:tblStylePr>
+    <w:tblStylePr w:type="lastRow">
+      <w:rPr>
+        <w:b/>
+        <w:color w:val="404040"/>
+      </w:rPr>
+      <w:pPr>
+        <w:pBdr/>
+        <w:spacing/>
+        <w:ind/>
+      </w:pPr>
+      <w:tblPr>
+        <w:tblBorders/>
+      </w:tblPr>
+      <w:tcPr>
+        <w:shd w:val="clear" w:color="ffffff"/>
+        <w:tcBorders>
+          <w:top w:val="none" w:color="000000" w:sz="4" w:space="0"/>
+          <w:left w:val="none" w:color="000000" w:sz="4" w:space="0"/>
+          <w:bottom w:val="none" w:color="000000" w:sz="4" w:space="0"/>
+          <w:right w:val="none" w:color="000000" w:sz="4" w:space="0"/>
+        </w:tcBorders>
+      </w:tcPr>
+    </w:tblStylePr>
     <w:tblStylePr w:type="nwCell">
       <w:pPr>
         <w:pBdr/>
@@ -5907,9 +6386,9 @@
       </w:tcPr>
     </w:tblStylePr>
   </w:style>
-  <w:style w:type="table" w:styleId="34">
+  <w:style w:type="table" w:styleId="725">
     <w:name w:val="Grid Table 3 - Accent 1"/>
-    <w:basedOn w:val="665"/>
+    <w:basedOn w:val="889"/>
     <w:uiPriority w:val="99"/>
     <w:pPr>
       <w:pBdr/>
@@ -6008,29 +6487,6 @@
         <w:tblBorders/>
       </w:tblPr>
       <w:tcPr>
-        <w:shd w:color="ffffff"/>
-        <w:tcBorders>
-          <w:top w:val="none" w:color="000000" w:sz="4" w:space="0"/>
-          <w:left w:val="none" w:color="000000" w:sz="4" w:space="0"/>
-          <w:bottom w:val="none" w:color="000000" w:sz="4" w:space="0"/>
-          <w:right w:val="none" w:color="000000" w:sz="4" w:space="0"/>
-        </w:tcBorders>
-      </w:tcPr>
-    </w:tblStylePr>
-    <w:tblStylePr w:type="firstRow">
-      <w:rPr>
-        <w:b/>
-        <w:color w:val="404040"/>
-      </w:rPr>
-      <w:pPr>
-        <w:pBdr/>
-        <w:spacing/>
-        <w:ind/>
-      </w:pPr>
-      <w:tblPr>
-        <w:tblBorders/>
-      </w:tblPr>
-      <w:tcPr>
         <w:shd w:val="clear" w:color="ffffff"/>
         <w:tcBorders>
           <w:top w:val="none" w:color="000000" w:sz="4" w:space="0"/>
@@ -6040,30 +6496,7 @@
         </w:tcBorders>
       </w:tcPr>
     </w:tblStylePr>
-    <w:tblStylePr w:type="lastCol">
-      <w:rPr>
-        <w:i/>
-        <w:color w:val="404040"/>
-      </w:rPr>
-      <w:pPr>
-        <w:pBdr/>
-        <w:spacing/>
-        <w:ind/>
-      </w:pPr>
-      <w:tblPr>
-        <w:tblBorders/>
-      </w:tblPr>
-      <w:tcPr>
-        <w:shd w:color="ffffff"/>
-        <w:tcBorders>
-          <w:top w:val="none" w:color="000000" w:sz="4" w:space="0"/>
-          <w:left w:val="none" w:color="000000" w:sz="4" w:space="0"/>
-          <w:bottom w:val="none" w:color="000000" w:sz="4" w:space="0"/>
-          <w:right w:val="none" w:color="000000" w:sz="4" w:space="0"/>
-        </w:tcBorders>
-      </w:tcPr>
-    </w:tblStylePr>
-    <w:tblStylePr w:type="lastRow">
+    <w:tblStylePr w:type="firstRow">
       <w:rPr>
         <w:b/>
         <w:color w:val="404040"/>
@@ -6086,6 +6519,52 @@
         </w:tcBorders>
       </w:tcPr>
     </w:tblStylePr>
+    <w:tblStylePr w:type="lastCol">
+      <w:rPr>
+        <w:i/>
+        <w:color w:val="404040"/>
+      </w:rPr>
+      <w:pPr>
+        <w:pBdr/>
+        <w:spacing/>
+        <w:ind/>
+      </w:pPr>
+      <w:tblPr>
+        <w:tblBorders/>
+      </w:tblPr>
+      <w:tcPr>
+        <w:shd w:val="clear" w:color="ffffff"/>
+        <w:tcBorders>
+          <w:top w:val="none" w:color="000000" w:sz="4" w:space="0"/>
+          <w:left w:val="none" w:color="000000" w:sz="4" w:space="0"/>
+          <w:bottom w:val="none" w:color="000000" w:sz="4" w:space="0"/>
+          <w:right w:val="none" w:color="000000" w:sz="4" w:space="0"/>
+        </w:tcBorders>
+      </w:tcPr>
+    </w:tblStylePr>
+    <w:tblStylePr w:type="lastRow">
+      <w:rPr>
+        <w:b/>
+        <w:color w:val="404040"/>
+      </w:rPr>
+      <w:pPr>
+        <w:pBdr/>
+        <w:spacing/>
+        <w:ind/>
+      </w:pPr>
+      <w:tblPr>
+        <w:tblBorders/>
+      </w:tblPr>
+      <w:tcPr>
+        <w:shd w:val="clear" w:color="ffffff"/>
+        <w:tcBorders>
+          <w:top w:val="none" w:color="000000" w:sz="4" w:space="0"/>
+          <w:left w:val="none" w:color="000000" w:sz="4" w:space="0"/>
+          <w:bottom w:val="none" w:color="000000" w:sz="4" w:space="0"/>
+          <w:right w:val="none" w:color="000000" w:sz="4" w:space="0"/>
+        </w:tcBorders>
+      </w:tcPr>
+    </w:tblStylePr>
     <w:tblStylePr w:type="nwCell">
       <w:pPr>
         <w:pBdr/>
@@ -6152,9 +6631,9 @@
       </w:tcPr>
     </w:tblStylePr>
   </w:style>
-  <w:style w:type="table" w:styleId="35">
+  <w:style w:type="table" w:styleId="726">
     <w:name w:val="Grid Table 3 - Accent 2"/>
-    <w:basedOn w:val="665"/>
+    <w:basedOn w:val="889"/>
     <w:uiPriority w:val="99"/>
     <w:pPr>
       <w:pBdr/>
@@ -6253,29 +6732,6 @@
         <w:tblBorders/>
       </w:tblPr>
       <w:tcPr>
-        <w:shd w:color="ffffff"/>
-        <w:tcBorders>
-          <w:top w:val="none" w:color="000000" w:sz="4" w:space="0"/>
-          <w:left w:val="none" w:color="000000" w:sz="4" w:space="0"/>
-          <w:bottom w:val="none" w:color="000000" w:sz="4" w:space="0"/>
-          <w:right w:val="none" w:color="000000" w:sz="4" w:space="0"/>
-        </w:tcBorders>
-      </w:tcPr>
-    </w:tblStylePr>
-    <w:tblStylePr w:type="firstRow">
-      <w:rPr>
-        <w:b/>
-        <w:color w:val="404040"/>
-      </w:rPr>
-      <w:pPr>
-        <w:pBdr/>
-        <w:spacing/>
-        <w:ind/>
-      </w:pPr>
-      <w:tblPr>
-        <w:tblBorders/>
-      </w:tblPr>
-      <w:tcPr>
         <w:shd w:val="clear" w:color="ffffff"/>
         <w:tcBorders>
           <w:top w:val="none" w:color="000000" w:sz="4" w:space="0"/>
@@ -6285,30 +6741,7 @@
         </w:tcBorders>
       </w:tcPr>
     </w:tblStylePr>
-    <w:tblStylePr w:type="lastCol">
-      <w:rPr>
-        <w:i/>
-        <w:color w:val="404040"/>
-      </w:rPr>
-      <w:pPr>
-        <w:pBdr/>
-        <w:spacing/>
-        <w:ind/>
-      </w:pPr>
-      <w:tblPr>
-        <w:tblBorders/>
-      </w:tblPr>
-      <w:tcPr>
-        <w:shd w:color="ffffff"/>
-        <w:tcBorders>
-          <w:top w:val="none" w:color="000000" w:sz="4" w:space="0"/>
-          <w:left w:val="none" w:color="000000" w:sz="4" w:space="0"/>
-          <w:bottom w:val="none" w:color="000000" w:sz="4" w:space="0"/>
-          <w:right w:val="none" w:color="000000" w:sz="4" w:space="0"/>
-        </w:tcBorders>
-      </w:tcPr>
-    </w:tblStylePr>
-    <w:tblStylePr w:type="lastRow">
+    <w:tblStylePr w:type="firstRow">
       <w:rPr>
         <w:b/>
         <w:color w:val="404040"/>
@@ -6331,6 +6764,52 @@
         </w:tcBorders>
       </w:tcPr>
     </w:tblStylePr>
+    <w:tblStylePr w:type="lastCol">
+      <w:rPr>
+        <w:i/>
+        <w:color w:val="404040"/>
+      </w:rPr>
+      <w:pPr>
+        <w:pBdr/>
+        <w:spacing/>
+        <w:ind/>
+      </w:pPr>
+      <w:tblPr>
+        <w:tblBorders/>
+      </w:tblPr>
+      <w:tcPr>
+        <w:shd w:val="clear" w:color="ffffff"/>
+        <w:tcBorders>
+          <w:top w:val="none" w:color="000000" w:sz="4" w:space="0"/>
+          <w:left w:val="none" w:color="000000" w:sz="4" w:space="0"/>
+          <w:bottom w:val="none" w:color="000000" w:sz="4" w:space="0"/>
+          <w:right w:val="none" w:color="000000" w:sz="4" w:space="0"/>
+        </w:tcBorders>
+      </w:tcPr>
+    </w:tblStylePr>
+    <w:tblStylePr w:type="lastRow">
+      <w:rPr>
+        <w:b/>
+        <w:color w:val="404040"/>
+      </w:rPr>
+      <w:pPr>
+        <w:pBdr/>
+        <w:spacing/>
+        <w:ind/>
+      </w:pPr>
+      <w:tblPr>
+        <w:tblBorders/>
+      </w:tblPr>
+      <w:tcPr>
+        <w:shd w:val="clear" w:color="ffffff"/>
+        <w:tcBorders>
+          <w:top w:val="none" w:color="000000" w:sz="4" w:space="0"/>
+          <w:left w:val="none" w:color="000000" w:sz="4" w:space="0"/>
+          <w:bottom w:val="none" w:color="000000" w:sz="4" w:space="0"/>
+          <w:right w:val="none" w:color="000000" w:sz="4" w:space="0"/>
+        </w:tcBorders>
+      </w:tcPr>
+    </w:tblStylePr>
     <w:tblStylePr w:type="nwCell">
       <w:pPr>
         <w:pBdr/>
@@ -6397,9 +6876,9 @@
       </w:tcPr>
     </w:tblStylePr>
   </w:style>
-  <w:style w:type="table" w:styleId="36">
+  <w:style w:type="table" w:styleId="727">
     <w:name w:val="Grid Table 3 - Accent 3"/>
-    <w:basedOn w:val="665"/>
+    <w:basedOn w:val="889"/>
     <w:uiPriority w:val="99"/>
     <w:pPr>
       <w:pBdr/>
@@ -6498,29 +6977,6 @@
         <w:tblBorders/>
       </w:tblPr>
       <w:tcPr>
-        <w:shd w:color="ffffff"/>
-        <w:tcBorders>
-          <w:top w:val="none" w:color="000000" w:sz="4" w:space="0"/>
-          <w:left w:val="none" w:color="000000" w:sz="4" w:space="0"/>
-          <w:bottom w:val="none" w:color="000000" w:sz="4" w:space="0"/>
-          <w:right w:val="none" w:color="000000" w:sz="4" w:space="0"/>
-        </w:tcBorders>
-      </w:tcPr>
-    </w:tblStylePr>
-    <w:tblStylePr w:type="firstRow">
-      <w:rPr>
-        <w:b/>
-        <w:color w:val="404040"/>
-      </w:rPr>
-      <w:pPr>
-        <w:pBdr/>
-        <w:spacing/>
-        <w:ind/>
-      </w:pPr>
-      <w:tblPr>
-        <w:tblBorders/>
-      </w:tblPr>
-      <w:tcPr>
         <w:shd w:val="clear" w:color="ffffff"/>
         <w:tcBorders>
           <w:top w:val="none" w:color="000000" w:sz="4" w:space="0"/>
@@ -6530,30 +6986,7 @@
         </w:tcBorders>
       </w:tcPr>
     </w:tblStylePr>
-    <w:tblStylePr w:type="lastCol">
-      <w:rPr>
-        <w:i/>
-        <w:color w:val="404040"/>
-      </w:rPr>
-      <w:pPr>
-        <w:pBdr/>
-        <w:spacing/>
-        <w:ind/>
-      </w:pPr>
-      <w:tblPr>
-        <w:tblBorders/>
-      </w:tblPr>
-      <w:tcPr>
-        <w:shd w:color="ffffff"/>
-        <w:tcBorders>
-          <w:top w:val="none" w:color="000000" w:sz="4" w:space="0"/>
-          <w:left w:val="none" w:color="000000" w:sz="4" w:space="0"/>
-          <w:bottom w:val="none" w:color="000000" w:sz="4" w:space="0"/>
-          <w:right w:val="none" w:color="000000" w:sz="4" w:space="0"/>
-        </w:tcBorders>
-      </w:tcPr>
-    </w:tblStylePr>
-    <w:tblStylePr w:type="lastRow">
+    <w:tblStylePr w:type="firstRow">
       <w:rPr>
         <w:b/>
         <w:color w:val="404040"/>
@@ -6576,6 +7009,52 @@
         </w:tcBorders>
       </w:tcPr>
     </w:tblStylePr>
+    <w:tblStylePr w:type="lastCol">
+      <w:rPr>
+        <w:i/>
+        <w:color w:val="404040"/>
+      </w:rPr>
+      <w:pPr>
+        <w:pBdr/>
+        <w:spacing/>
+        <w:ind/>
+      </w:pPr>
+      <w:tblPr>
+        <w:tblBorders/>
+      </w:tblPr>
+      <w:tcPr>
+        <w:shd w:val="clear" w:color="ffffff"/>
+        <w:tcBorders>
+          <w:top w:val="none" w:color="000000" w:sz="4" w:space="0"/>
+          <w:left w:val="none" w:color="000000" w:sz="4" w:space="0"/>
+          <w:bottom w:val="none" w:color="000000" w:sz="4" w:space="0"/>
+          <w:right w:val="none" w:color="000000" w:sz="4" w:space="0"/>
+        </w:tcBorders>
+      </w:tcPr>
+    </w:tblStylePr>
+    <w:tblStylePr w:type="lastRow">
+      <w:rPr>
+        <w:b/>
+        <w:color w:val="404040"/>
+      </w:rPr>
+      <w:pPr>
+        <w:pBdr/>
+        <w:spacing/>
+        <w:ind/>
+      </w:pPr>
+      <w:tblPr>
+        <w:tblBorders/>
+      </w:tblPr>
+      <w:tcPr>
+        <w:shd w:val="clear" w:color="ffffff"/>
+        <w:tcBorders>
+          <w:top w:val="none" w:color="000000" w:sz="4" w:space="0"/>
+          <w:left w:val="none" w:color="000000" w:sz="4" w:space="0"/>
+          <w:bottom w:val="none" w:color="000000" w:sz="4" w:space="0"/>
+          <w:right w:val="none" w:color="000000" w:sz="4" w:space="0"/>
+        </w:tcBorders>
+      </w:tcPr>
+    </w:tblStylePr>
     <w:tblStylePr w:type="nwCell">
       <w:pPr>
         <w:pBdr/>
@@ -6642,9 +7121,9 @@
       </w:tcPr>
     </w:tblStylePr>
   </w:style>
-  <w:style w:type="table" w:styleId="37">
+  <w:style w:type="table" w:styleId="728">
     <w:name w:val="Grid Table 3 - Accent 4"/>
-    <w:basedOn w:val="665"/>
+    <w:basedOn w:val="889"/>
     <w:uiPriority w:val="99"/>
     <w:pPr>
       <w:pBdr/>
@@ -6743,29 +7222,6 @@
         <w:tblBorders/>
       </w:tblPr>
       <w:tcPr>
-        <w:shd w:color="ffffff"/>
-        <w:tcBorders>
-          <w:top w:val="none" w:color="000000" w:sz="4" w:space="0"/>
-          <w:left w:val="none" w:color="000000" w:sz="4" w:space="0"/>
-          <w:bottom w:val="none" w:color="000000" w:sz="4" w:space="0"/>
-          <w:right w:val="none" w:color="000000" w:sz="4" w:space="0"/>
-        </w:tcBorders>
-      </w:tcPr>
-    </w:tblStylePr>
-    <w:tblStylePr w:type="firstRow">
-      <w:rPr>
-        <w:b/>
-        <w:color w:val="404040"/>
-      </w:rPr>
-      <w:pPr>
-        <w:pBdr/>
-        <w:spacing/>
-        <w:ind/>
-      </w:pPr>
-      <w:tblPr>
-        <w:tblBorders/>
-      </w:tblPr>
-      <w:tcPr>
         <w:shd w:val="clear" w:color="ffffff"/>
         <w:tcBorders>
           <w:top w:val="none" w:color="000000" w:sz="4" w:space="0"/>
@@ -6775,30 +7231,7 @@
         </w:tcBorders>
       </w:tcPr>
     </w:tblStylePr>
-    <w:tblStylePr w:type="lastCol">
-      <w:rPr>
-        <w:i/>
-        <w:color w:val="404040"/>
-      </w:rPr>
-      <w:pPr>
-        <w:pBdr/>
-        <w:spacing/>
-        <w:ind/>
-      </w:pPr>
-      <w:tblPr>
-        <w:tblBorders/>
-      </w:tblPr>
-      <w:tcPr>
-        <w:shd w:color="ffffff"/>
-        <w:tcBorders>
-          <w:top w:val="none" w:color="000000" w:sz="4" w:space="0"/>
-          <w:left w:val="none" w:color="000000" w:sz="4" w:space="0"/>
-          <w:bottom w:val="none" w:color="000000" w:sz="4" w:space="0"/>
-          <w:right w:val="none" w:color="000000" w:sz="4" w:space="0"/>
-        </w:tcBorders>
-      </w:tcPr>
-    </w:tblStylePr>
-    <w:tblStylePr w:type="lastRow">
+    <w:tblStylePr w:type="firstRow">
       <w:rPr>
         <w:b/>
         <w:color w:val="404040"/>
@@ -6821,6 +7254,52 @@
         </w:tcBorders>
       </w:tcPr>
     </w:tblStylePr>
+    <w:tblStylePr w:type="lastCol">
+      <w:rPr>
+        <w:i/>
+        <w:color w:val="404040"/>
+      </w:rPr>
+      <w:pPr>
+        <w:pBdr/>
+        <w:spacing/>
+        <w:ind/>
+      </w:pPr>
+      <w:tblPr>
+        <w:tblBorders/>
+      </w:tblPr>
+      <w:tcPr>
+        <w:shd w:val="clear" w:color="ffffff"/>
+        <w:tcBorders>
+          <w:top w:val="none" w:color="000000" w:sz="4" w:space="0"/>
+          <w:left w:val="none" w:color="000000" w:sz="4" w:space="0"/>
+          <w:bottom w:val="none" w:color="000000" w:sz="4" w:space="0"/>
+          <w:right w:val="none" w:color="000000" w:sz="4" w:space="0"/>
+        </w:tcBorders>
+      </w:tcPr>
+    </w:tblStylePr>
+    <w:tblStylePr w:type="lastRow">
+      <w:rPr>
+        <w:b/>
+        <w:color w:val="404040"/>
+      </w:rPr>
+      <w:pPr>
+        <w:pBdr/>
+        <w:spacing/>
+        <w:ind/>
+      </w:pPr>
+      <w:tblPr>
+        <w:tblBorders/>
+      </w:tblPr>
+      <w:tcPr>
+        <w:shd w:val="clear" w:color="ffffff"/>
+        <w:tcBorders>
+          <w:top w:val="none" w:color="000000" w:sz="4" w:space="0"/>
+          <w:left w:val="none" w:color="000000" w:sz="4" w:space="0"/>
+          <w:bottom w:val="none" w:color="000000" w:sz="4" w:space="0"/>
+          <w:right w:val="none" w:color="000000" w:sz="4" w:space="0"/>
+        </w:tcBorders>
+      </w:tcPr>
+    </w:tblStylePr>
     <w:tblStylePr w:type="nwCell">
       <w:pPr>
         <w:pBdr/>
@@ -6887,9 +7366,9 @@
       </w:tcPr>
     </w:tblStylePr>
   </w:style>
-  <w:style w:type="table" w:styleId="38">
+  <w:style w:type="table" w:styleId="729">
     <w:name w:val="Grid Table 3 - Accent 5"/>
-    <w:basedOn w:val="665"/>
+    <w:basedOn w:val="889"/>
     <w:uiPriority w:val="99"/>
     <w:pPr>
       <w:pBdr/>
@@ -6988,29 +7467,6 @@
         <w:tblBorders/>
       </w:tblPr>
       <w:tcPr>
-        <w:shd w:color="ffffff"/>
-        <w:tcBorders>
-          <w:top w:val="none" w:color="000000" w:sz="4" w:space="0"/>
-          <w:left w:val="none" w:color="000000" w:sz="4" w:space="0"/>
-          <w:bottom w:val="none" w:color="000000" w:sz="4" w:space="0"/>
-          <w:right w:val="none" w:color="000000" w:sz="4" w:space="0"/>
-        </w:tcBorders>
-      </w:tcPr>
-    </w:tblStylePr>
-    <w:tblStylePr w:type="firstRow">
-      <w:rPr>
-        <w:b/>
-        <w:color w:val="404040"/>
-      </w:rPr>
-      <w:pPr>
-        <w:pBdr/>
-        <w:spacing/>
-        <w:ind/>
-      </w:pPr>
-      <w:tblPr>
-        <w:tblBorders/>
-      </w:tblPr>
-      <w:tcPr>
         <w:shd w:val="clear" w:color="ffffff"/>
         <w:tcBorders>
           <w:top w:val="none" w:color="000000" w:sz="4" w:space="0"/>
@@ -7020,30 +7476,7 @@
         </w:tcBorders>
       </w:tcPr>
     </w:tblStylePr>
-    <w:tblStylePr w:type="lastCol">
-      <w:rPr>
-        <w:i/>
-        <w:color w:val="404040"/>
-      </w:rPr>
-      <w:pPr>
-        <w:pBdr/>
-        <w:spacing/>
-        <w:ind/>
-      </w:pPr>
-      <w:tblPr>
-        <w:tblBorders/>
-      </w:tblPr>
-      <w:tcPr>
-        <w:shd w:color="ffffff"/>
-        <w:tcBorders>
-          <w:top w:val="none" w:color="000000" w:sz="4" w:space="0"/>
-          <w:left w:val="none" w:color="000000" w:sz="4" w:space="0"/>
-          <w:bottom w:val="none" w:color="000000" w:sz="4" w:space="0"/>
-          <w:right w:val="none" w:color="000000" w:sz="4" w:space="0"/>
-        </w:tcBorders>
-      </w:tcPr>
-    </w:tblStylePr>
-    <w:tblStylePr w:type="lastRow">
+    <w:tblStylePr w:type="firstRow">
       <w:rPr>
         <w:b/>
         <w:color w:val="404040"/>
@@ -7066,6 +7499,52 @@
         </w:tcBorders>
       </w:tcPr>
     </w:tblStylePr>
+    <w:tblStylePr w:type="lastCol">
+      <w:rPr>
+        <w:i/>
+        <w:color w:val="404040"/>
+      </w:rPr>
+      <w:pPr>
+        <w:pBdr/>
+        <w:spacing/>
+        <w:ind/>
+      </w:pPr>
+      <w:tblPr>
+        <w:tblBorders/>
+      </w:tblPr>
+      <w:tcPr>
+        <w:shd w:val="clear" w:color="ffffff"/>
+        <w:tcBorders>
+          <w:top w:val="none" w:color="000000" w:sz="4" w:space="0"/>
+          <w:left w:val="none" w:color="000000" w:sz="4" w:space="0"/>
+          <w:bottom w:val="none" w:color="000000" w:sz="4" w:space="0"/>
+          <w:right w:val="none" w:color="000000" w:sz="4" w:space="0"/>
+        </w:tcBorders>
+      </w:tcPr>
+    </w:tblStylePr>
+    <w:tblStylePr w:type="lastRow">
+      <w:rPr>
+        <w:b/>
+        <w:color w:val="404040"/>
+      </w:rPr>
+      <w:pPr>
+        <w:pBdr/>
+        <w:spacing/>
+        <w:ind/>
+      </w:pPr>
+      <w:tblPr>
+        <w:tblBorders/>
+      </w:tblPr>
+      <w:tcPr>
+        <w:shd w:val="clear" w:color="ffffff"/>
+        <w:tcBorders>
+          <w:top w:val="none" w:color="000000" w:sz="4" w:space="0"/>
+          <w:left w:val="none" w:color="000000" w:sz="4" w:space="0"/>
+          <w:bottom w:val="none" w:color="000000" w:sz="4" w:space="0"/>
+          <w:right w:val="none" w:color="000000" w:sz="4" w:space="0"/>
+        </w:tcBorders>
+      </w:tcPr>
+    </w:tblStylePr>
     <w:tblStylePr w:type="nwCell">
       <w:pPr>
         <w:pBdr/>
@@ -7132,9 +7611,9 @@
       </w:tcPr>
     </w:tblStylePr>
   </w:style>
-  <w:style w:type="table" w:styleId="39">
+  <w:style w:type="table" w:styleId="730">
     <w:name w:val="Grid Table 3 - Accent 6"/>
-    <w:basedOn w:val="665"/>
+    <w:basedOn w:val="889"/>
     <w:uiPriority w:val="99"/>
     <w:pPr>
       <w:pBdr/>
@@ -7233,29 +7712,6 @@
         <w:tblBorders/>
       </w:tblPr>
       <w:tcPr>
-        <w:shd w:color="ffffff"/>
-        <w:tcBorders>
-          <w:top w:val="none" w:color="000000" w:sz="4" w:space="0"/>
-          <w:left w:val="none" w:color="000000" w:sz="4" w:space="0"/>
-          <w:bottom w:val="none" w:color="000000" w:sz="4" w:space="0"/>
-          <w:right w:val="none" w:color="000000" w:sz="4" w:space="0"/>
-        </w:tcBorders>
-      </w:tcPr>
-    </w:tblStylePr>
-    <w:tblStylePr w:type="firstRow">
-      <w:rPr>
-        <w:b/>
-        <w:color w:val="404040"/>
-      </w:rPr>
-      <w:pPr>
-        <w:pBdr/>
-        <w:spacing/>
-        <w:ind/>
-      </w:pPr>
-      <w:tblPr>
-        <w:tblBorders/>
-      </w:tblPr>
-      <w:tcPr>
         <w:shd w:val="clear" w:color="ffffff"/>
         <w:tcBorders>
           <w:top w:val="none" w:color="000000" w:sz="4" w:space="0"/>
@@ -7265,30 +7721,7 @@
         </w:tcBorders>
       </w:tcPr>
     </w:tblStylePr>
-    <w:tblStylePr w:type="lastCol">
-      <w:rPr>
-        <w:i/>
-        <w:color w:val="404040"/>
-      </w:rPr>
-      <w:pPr>
-        <w:pBdr/>
-        <w:spacing/>
-        <w:ind/>
-      </w:pPr>
-      <w:tblPr>
-        <w:tblBorders/>
-      </w:tblPr>
-      <w:tcPr>
-        <w:shd w:color="ffffff"/>
-        <w:tcBorders>
-          <w:top w:val="none" w:color="000000" w:sz="4" w:space="0"/>
-          <w:left w:val="none" w:color="000000" w:sz="4" w:space="0"/>
-          <w:bottom w:val="none" w:color="000000" w:sz="4" w:space="0"/>
-          <w:right w:val="none" w:color="000000" w:sz="4" w:space="0"/>
-        </w:tcBorders>
-      </w:tcPr>
-    </w:tblStylePr>
-    <w:tblStylePr w:type="lastRow">
+    <w:tblStylePr w:type="firstRow">
       <w:rPr>
         <w:b/>
         <w:color w:val="404040"/>
@@ -7311,6 +7744,52 @@
         </w:tcBorders>
       </w:tcPr>
     </w:tblStylePr>
+    <w:tblStylePr w:type="lastCol">
+      <w:rPr>
+        <w:i/>
+        <w:color w:val="404040"/>
+      </w:rPr>
+      <w:pPr>
+        <w:pBdr/>
+        <w:spacing/>
+        <w:ind/>
+      </w:pPr>
+      <w:tblPr>
+        <w:tblBorders/>
+      </w:tblPr>
+      <w:tcPr>
+        <w:shd w:val="clear" w:color="ffffff"/>
+        <w:tcBorders>
+          <w:top w:val="none" w:color="000000" w:sz="4" w:space="0"/>
+          <w:left w:val="none" w:color="000000" w:sz="4" w:space="0"/>
+          <w:bottom w:val="none" w:color="000000" w:sz="4" w:space="0"/>
+          <w:right w:val="none" w:color="000000" w:sz="4" w:space="0"/>
+        </w:tcBorders>
+      </w:tcPr>
+    </w:tblStylePr>
+    <w:tblStylePr w:type="lastRow">
+      <w:rPr>
+        <w:b/>
+        <w:color w:val="404040"/>
+      </w:rPr>
+      <w:pPr>
+        <w:pBdr/>
+        <w:spacing/>
+        <w:ind/>
+      </w:pPr>
+      <w:tblPr>
+        <w:tblBorders/>
+      </w:tblPr>
+      <w:tcPr>
+        <w:shd w:val="clear" w:color="ffffff"/>
+        <w:tcBorders>
+          <w:top w:val="none" w:color="000000" w:sz="4" w:space="0"/>
+          <w:left w:val="none" w:color="000000" w:sz="4" w:space="0"/>
+          <w:bottom w:val="none" w:color="000000" w:sz="4" w:space="0"/>
+          <w:right w:val="none" w:color="000000" w:sz="4" w:space="0"/>
+        </w:tcBorders>
+      </w:tcPr>
+    </w:tblStylePr>
     <w:tblStylePr w:type="nwCell">
       <w:pPr>
         <w:pBdr/>
@@ -7377,9 +7856,9 @@
       </w:tcPr>
     </w:tblStylePr>
   </w:style>
-  <w:style w:type="table" w:styleId="40">
+  <w:style w:type="table" w:styleId="731">
     <w:name w:val="Grid Table 4"/>
-    <w:basedOn w:val="665"/>
+    <w:basedOn w:val="889"/>
     <w:uiPriority w:val="59"/>
     <w:pPr>
       <w:pBdr/>
@@ -7610,9 +8089,9 @@
       </w:tcPr>
     </w:tblStylePr>
   </w:style>
-  <w:style w:type="table" w:styleId="41">
+  <w:style w:type="table" w:styleId="732">
     <w:name w:val="Grid Table 4 - Accent 1"/>
-    <w:basedOn w:val="665"/>
+    <w:basedOn w:val="889"/>
     <w:uiPriority w:val="59"/>
     <w:pPr>
       <w:pBdr/>
@@ -7843,9 +8322,9 @@
       </w:tcPr>
     </w:tblStylePr>
   </w:style>
-  <w:style w:type="table" w:styleId="42">
+  <w:style w:type="table" w:styleId="733">
     <w:name w:val="Grid Table 4 - Accent 2"/>
-    <w:basedOn w:val="665"/>
+    <w:basedOn w:val="889"/>
     <w:uiPriority w:val="59"/>
     <w:pPr>
       <w:pBdr/>
@@ -8076,9 +8555,9 @@
       </w:tcPr>
     </w:tblStylePr>
   </w:style>
-  <w:style w:type="table" w:styleId="43">
+  <w:style w:type="table" w:styleId="734">
     <w:name w:val="Grid Table 4 - Accent 3"/>
-    <w:basedOn w:val="665"/>
+    <w:basedOn w:val="889"/>
     <w:uiPriority w:val="59"/>
     <w:pPr>
       <w:pBdr/>
@@ -8309,9 +8788,9 @@
       </w:tcPr>
     </w:tblStylePr>
   </w:style>
-  <w:style w:type="table" w:styleId="44">
+  <w:style w:type="table" w:styleId="735">
     <w:name w:val="Grid Table 4 - Accent 4"/>
-    <w:basedOn w:val="665"/>
+    <w:basedOn w:val="889"/>
     <w:uiPriority w:val="59"/>
     <w:pPr>
       <w:pBdr/>
@@ -8542,9 +9021,9 @@
       </w:tcPr>
     </w:tblStylePr>
   </w:style>
-  <w:style w:type="table" w:styleId="45">
+  <w:style w:type="table" w:styleId="736">
     <w:name w:val="Grid Table 4 - Accent 5"/>
-    <w:basedOn w:val="665"/>
+    <w:basedOn w:val="889"/>
     <w:uiPriority w:val="59"/>
     <w:pPr>
       <w:pBdr/>
@@ -8775,9 +9254,9 @@
       </w:tcPr>
     </w:tblStylePr>
   </w:style>
-  <w:style w:type="table" w:styleId="46">
+  <w:style w:type="table" w:styleId="737">
     <w:name w:val="Grid Table 4 - Accent 6"/>
-    <w:basedOn w:val="665"/>
+    <w:basedOn w:val="889"/>
     <w:uiPriority w:val="59"/>
     <w:pPr>
       <w:pBdr/>
@@ -9008,9 +9487,9 @@
       </w:tcPr>
     </w:tblStylePr>
   </w:style>
-  <w:style w:type="table" w:styleId="47">
+  <w:style w:type="table" w:styleId="738">
     <w:name w:val="Grid Table 5 Dark"/>
-    <w:basedOn w:val="665"/>
+    <w:basedOn w:val="889"/>
     <w:uiPriority w:val="99"/>
     <w:pPr>
       <w:pBdr/>
@@ -9236,9 +9715,9 @@
       </w:tcPr>
     </w:tblStylePr>
   </w:style>
-  <w:style w:type="table" w:styleId="48">
+  <w:style w:type="table" w:styleId="739">
     <w:name w:val="Grid Table 5 Dark- Accent 1"/>
-    <w:basedOn w:val="665"/>
+    <w:basedOn w:val="889"/>
     <w:uiPriority w:val="99"/>
     <w:pPr>
       <w:pBdr/>
@@ -9464,9 +9943,9 @@
       </w:tcPr>
     </w:tblStylePr>
   </w:style>
-  <w:style w:type="table" w:styleId="49">
+  <w:style w:type="table" w:styleId="740">
     <w:name w:val="Grid Table 5 Dark - Accent 2"/>
-    <w:basedOn w:val="665"/>
+    <w:basedOn w:val="889"/>
     <w:uiPriority w:val="99"/>
     <w:pPr>
       <w:pBdr/>
@@ -9692,9 +10171,9 @@
       </w:tcPr>
     </w:tblStylePr>
   </w:style>
-  <w:style w:type="table" w:styleId="50">
+  <w:style w:type="table" w:styleId="741">
     <w:name w:val="Grid Table 5 Dark - Accent 3"/>
-    <w:basedOn w:val="665"/>
+    <w:basedOn w:val="889"/>
     <w:uiPriority w:val="99"/>
     <w:pPr>
       <w:pBdr/>
@@ -9920,9 +10399,9 @@
       </w:tcPr>
     </w:tblStylePr>
   </w:style>
-  <w:style w:type="table" w:styleId="51">
+  <w:style w:type="table" w:styleId="742">
     <w:name w:val="Grid Table 5 Dark- Accent 4"/>
-    <w:basedOn w:val="665"/>
+    <w:basedOn w:val="889"/>
     <w:uiPriority w:val="99"/>
     <w:pPr>
       <w:pBdr/>
@@ -10148,9 +10627,9 @@
       </w:tcPr>
     </w:tblStylePr>
   </w:style>
-  <w:style w:type="table" w:styleId="52">
+  <w:style w:type="table" w:styleId="743">
     <w:name w:val="Grid Table 5 Dark - Accent 5"/>
-    <w:basedOn w:val="665"/>
+    <w:basedOn w:val="889"/>
     <w:uiPriority w:val="99"/>
     <w:pPr>
       <w:pBdr/>
@@ -10376,9 +10855,9 @@
       </w:tcPr>
     </w:tblStylePr>
   </w:style>
-  <w:style w:type="table" w:styleId="53">
+  <w:style w:type="table" w:styleId="744">
     <w:name w:val="Grid Table 5 Dark - Accent 6"/>
-    <w:basedOn w:val="665"/>
+    <w:basedOn w:val="889"/>
     <w:uiPriority w:val="99"/>
     <w:pPr>
       <w:pBdr/>
@@ -10604,9 +11083,9 @@
       </w:tcPr>
     </w:tblStylePr>
   </w:style>
-  <w:style w:type="table" w:styleId="54">
+  <w:style w:type="table" w:styleId="745">
     <w:name w:val="Grid Table 6 Colorful"/>
-    <w:basedOn w:val="665"/>
+    <w:basedOn w:val="889"/>
     <w:uiPriority w:val="99"/>
     <w:pPr>
       <w:pBdr/>
@@ -10834,9 +11313,9 @@
       </w:tcPr>
     </w:tblStylePr>
   </w:style>
-  <w:style w:type="table" w:styleId="55">
+  <w:style w:type="table" w:styleId="746">
     <w:name w:val="Grid Table 6 Colorful - Accent 1"/>
-    <w:basedOn w:val="665"/>
+    <w:basedOn w:val="889"/>
     <w:uiPriority w:val="99"/>
     <w:pPr>
       <w:pBdr/>
@@ -11064,9 +11543,9 @@
       </w:tcPr>
     </w:tblStylePr>
   </w:style>
-  <w:style w:type="table" w:styleId="56">
+  <w:style w:type="table" w:styleId="747">
     <w:name w:val="Grid Table 6 Colorful - Accent 2"/>
-    <w:basedOn w:val="665"/>
+    <w:basedOn w:val="889"/>
     <w:uiPriority w:val="99"/>
     <w:pPr>
       <w:pBdr/>
@@ -11294,9 +11773,9 @@
       </w:tcPr>
     </w:tblStylePr>
   </w:style>
-  <w:style w:type="table" w:styleId="57">
+  <w:style w:type="table" w:styleId="748">
     <w:name w:val="Grid Table 6 Colorful - Accent 3"/>
-    <w:basedOn w:val="665"/>
+    <w:basedOn w:val="889"/>
     <w:uiPriority w:val="99"/>
     <w:pPr>
       <w:pBdr/>
@@ -11524,9 +12003,9 @@
       </w:tcPr>
     </w:tblStylePr>
   </w:style>
-  <w:style w:type="table" w:styleId="58">
+  <w:style w:type="table" w:styleId="749">
     <w:name w:val="Grid Table 6 Colorful - Accent 4"/>
-    <w:basedOn w:val="665"/>
+    <w:basedOn w:val="889"/>
     <w:uiPriority w:val="99"/>
     <w:pPr>
       <w:pBdr/>
@@ -11754,9 +12233,9 @@
       </w:tcPr>
     </w:tblStylePr>
   </w:style>
-  <w:style w:type="table" w:styleId="59">
+  <w:style w:type="table" w:styleId="750">
     <w:name w:val="Grid Table 6 Colorful - Accent 5"/>
-    <w:basedOn w:val="665"/>
+    <w:basedOn w:val="889"/>
     <w:uiPriority w:val="99"/>
     <w:pPr>
       <w:pBdr/>
@@ -11984,9 +12463,9 @@
       </w:tcPr>
     </w:tblStylePr>
   </w:style>
-  <w:style w:type="table" w:styleId="60">
+  <w:style w:type="table" w:styleId="751">
     <w:name w:val="Grid Table 6 Colorful - Accent 6"/>
-    <w:basedOn w:val="665"/>
+    <w:basedOn w:val="889"/>
     <w:uiPriority w:val="99"/>
     <w:pPr>
       <w:pBdr/>
@@ -12214,9 +12693,9 @@
       </w:tcPr>
     </w:tblStylePr>
   </w:style>
-  <w:style w:type="table" w:styleId="61">
+  <w:style w:type="table" w:styleId="752">
     <w:name w:val="Grid Table 7 Colorful"/>
-    <w:basedOn w:val="665"/>
+    <w:basedOn w:val="889"/>
     <w:uiPriority w:val="99"/>
     <w:pPr>
       <w:pBdr/>
@@ -12318,11 +12797,11 @@
         <w:tblBorders/>
       </w:tblPr>
       <w:tcPr>
-        <w:shd w:color="ffffff"/>
+        <w:shd w:val="clear" w:color="ffffff"/>
         <w:tcBorders>
-          <w:top w:val="none"/>
-          <w:left w:val="none"/>
-          <w:bottom w:val="none"/>
+          <w:top w:val="none" w:color="000000" w:sz="4" w:space="0"/>
+          <w:left w:val="none" w:color="000000" w:sz="4" w:space="0"/>
+          <w:bottom w:val="none" w:color="000000" w:sz="4" w:space="0"/>
           <w:right w:val="single" w:color="000000" w:themeColor="text1" w:themeTint="80" w:sz="4" w:space="0"/>
         </w:tcBorders>
       </w:tcPr>
@@ -12345,10 +12824,10 @@
       <w:tcPr>
         <w:shd w:val="clear" w:color="ffffff" w:themeColor="light1" w:fill="ffffff" w:themeFill="light1"/>
         <w:tcBorders>
-          <w:top w:val="none"/>
-          <w:left w:val="none"/>
+          <w:top w:val="none" w:color="000000" w:sz="4" w:space="0"/>
+          <w:left w:val="none" w:color="000000" w:sz="4" w:space="0"/>
           <w:bottom w:val="single" w:color="000000" w:themeColor="text1" w:themeTint="80" w:sz="4" w:space="0"/>
-          <w:right w:val="none"/>
+          <w:right w:val="none" w:color="000000" w:sz="4" w:space="0"/>
         </w:tcBorders>
       </w:tcPr>
     </w:tblStylePr>
@@ -12368,12 +12847,12 @@
         <w:tblBorders/>
       </w:tblPr>
       <w:tcPr>
-        <w:shd w:color="ffffff"/>
+        <w:shd w:val="clear" w:color="ffffff"/>
         <w:tcBorders>
-          <w:top w:val="none"/>
+          <w:top w:val="none" w:color="000000" w:sz="4" w:space="0"/>
           <w:left w:val="single" w:color="000000" w:themeColor="text1" w:themeTint="80" w:sz="4" w:space="0"/>
-          <w:bottom w:val="none"/>
-          <w:right w:val="none"/>
+          <w:bottom w:val="none" w:color="000000" w:sz="4" w:space="0"/>
+          <w:right w:val="none" w:color="000000" w:sz="4" w:space="0"/>
         </w:tcBorders>
       </w:tcPr>
     </w:tblStylePr>
@@ -12396,9 +12875,9 @@
         <w:shd w:val="clear" w:color="ffffff" w:themeColor="light1" w:fill="ffffff" w:themeFill="light1"/>
         <w:tcBorders>
           <w:top w:val="single" w:color="000000" w:themeColor="text1" w:themeTint="80" w:sz="4" w:space="0"/>
-          <w:left w:val="none"/>
-          <w:bottom w:val="none"/>
-          <w:right w:val="none"/>
+          <w:left w:val="none" w:color="000000" w:sz="4" w:space="0"/>
+          <w:bottom w:val="none" w:color="000000" w:sz="4" w:space="0"/>
+          <w:right w:val="none" w:color="000000" w:sz="4" w:space="0"/>
         </w:tcBorders>
       </w:tcPr>
     </w:tblStylePr>
@@ -12468,9 +12947,9 @@
       </w:tcPr>
     </w:tblStylePr>
   </w:style>
-  <w:style w:type="table" w:styleId="62">
+  <w:style w:type="table" w:styleId="753">
     <w:name w:val="Grid Table 7 Colorful - Accent 1"/>
-    <w:basedOn w:val="665"/>
+    <w:basedOn w:val="889"/>
     <w:uiPriority w:val="99"/>
     <w:pPr>
       <w:pBdr/>
@@ -12572,11 +13051,11 @@
         <w:tblBorders/>
       </w:tblPr>
       <w:tcPr>
-        <w:shd w:color="ffffff"/>
+        <w:shd w:val="clear" w:color="ffffff"/>
         <w:tcBorders>
-          <w:top w:val="none"/>
-          <w:left w:val="none"/>
-          <w:bottom w:val="none"/>
+          <w:top w:val="none" w:color="000000" w:sz="4" w:space="0"/>
+          <w:left w:val="none" w:color="000000" w:sz="4" w:space="0"/>
+          <w:bottom w:val="none" w:color="000000" w:sz="4" w:space="0"/>
           <w:right w:val="single" w:color="000000" w:themeColor="accent1" w:themeTint="80" w:sz="4" w:space="0"/>
         </w:tcBorders>
       </w:tcPr>
@@ -12599,10 +13078,10 @@
       <w:tcPr>
         <w:shd w:val="clear" w:color="ffffff" w:themeColor="light1" w:fill="ffffff" w:themeFill="light1"/>
         <w:tcBorders>
-          <w:top w:val="none"/>
-          <w:left w:val="none"/>
+          <w:top w:val="none" w:color="000000" w:sz="4" w:space="0"/>
+          <w:left w:val="none" w:color="000000" w:sz="4" w:space="0"/>
           <w:bottom w:val="single" w:color="000000" w:themeColor="accent1" w:themeTint="80" w:sz="4" w:space="0"/>
-          <w:right w:val="none"/>
+          <w:right w:val="none" w:color="000000" w:sz="4" w:space="0"/>
         </w:tcBorders>
       </w:tcPr>
     </w:tblStylePr>
@@ -12622,12 +13101,12 @@
         <w:tblBorders/>
       </w:tblPr>
       <w:tcPr>
-        <w:shd w:color="ffffff"/>
+        <w:shd w:val="clear" w:color="ffffff"/>
         <w:tcBorders>
-          <w:top w:val="none"/>
+          <w:top w:val="none" w:color="000000" w:sz="4" w:space="0"/>
           <w:left w:val="single" w:color="000000" w:themeColor="accent1" w:themeTint="80" w:sz="4" w:space="0"/>
-          <w:bottom w:val="none"/>
-          <w:right w:val="none"/>
+          <w:bottom w:val="none" w:color="000000" w:sz="4" w:space="0"/>
+          <w:right w:val="none" w:color="000000" w:sz="4" w:space="0"/>
         </w:tcBorders>
       </w:tcPr>
     </w:tblStylePr>
@@ -12650,9 +13129,9 @@
         <w:shd w:val="clear" w:color="ffffff" w:themeColor="light1" w:fill="ffffff" w:themeFill="light1"/>
         <w:tcBorders>
           <w:top w:val="single" w:color="000000" w:themeColor="accent1" w:themeTint="80" w:sz="4" w:space="0"/>
-          <w:left w:val="none"/>
-          <w:bottom w:val="none"/>
-          <w:right w:val="none"/>
+          <w:left w:val="none" w:color="000000" w:sz="4" w:space="0"/>
+          <w:bottom w:val="none" w:color="000000" w:sz="4" w:space="0"/>
+          <w:right w:val="none" w:color="000000" w:sz="4" w:space="0"/>
         </w:tcBorders>
       </w:tcPr>
     </w:tblStylePr>
@@ -12722,9 +13201,9 @@
       </w:tcPr>
     </w:tblStylePr>
   </w:style>
-  <w:style w:type="table" w:styleId="63">
+  <w:style w:type="table" w:styleId="754">
     <w:name w:val="Grid Table 7 Colorful - Accent 2"/>
-    <w:basedOn w:val="665"/>
+    <w:basedOn w:val="889"/>
     <w:uiPriority w:val="99"/>
     <w:pPr>
       <w:pBdr/>
@@ -12826,11 +13305,11 @@
         <w:tblBorders/>
       </w:tblPr>
       <w:tcPr>
-        <w:shd w:color="ffffff"/>
+        <w:shd w:val="clear" w:color="ffffff"/>
         <w:tcBorders>
-          <w:top w:val="none"/>
-          <w:left w:val="none"/>
-          <w:bottom w:val="none"/>
+          <w:top w:val="none" w:color="000000" w:sz="4" w:space="0"/>
+          <w:left w:val="none" w:color="000000" w:sz="4" w:space="0"/>
+          <w:bottom w:val="none" w:color="000000" w:sz="4" w:space="0"/>
           <w:right w:val="single" w:color="000000" w:themeColor="accent2" w:themeTint="97" w:sz="4" w:space="0"/>
         </w:tcBorders>
       </w:tcPr>
@@ -12853,10 +13332,10 @@
       <w:tcPr>
         <w:shd w:val="clear" w:color="ffffff" w:themeColor="light1" w:fill="ffffff" w:themeFill="light1"/>
         <w:tcBorders>
-          <w:top w:val="none"/>
-          <w:left w:val="none"/>
+          <w:top w:val="none" w:color="000000" w:sz="4" w:space="0"/>
+          <w:left w:val="none" w:color="000000" w:sz="4" w:space="0"/>
           <w:bottom w:val="single" w:color="000000" w:themeColor="accent2" w:themeTint="97" w:sz="4" w:space="0"/>
-          <w:right w:val="none"/>
+          <w:right w:val="none" w:color="000000" w:sz="4" w:space="0"/>
         </w:tcBorders>
       </w:tcPr>
     </w:tblStylePr>
@@ -12876,12 +13355,12 @@
         <w:tblBorders/>
       </w:tblPr>
       <w:tcPr>
-        <w:shd w:color="ffffff"/>
+        <w:shd w:val="clear" w:color="ffffff"/>
         <w:tcBorders>
-          <w:top w:val="none"/>
+          <w:top w:val="none" w:color="000000" w:sz="4" w:space="0"/>
           <w:left w:val="single" w:color="000000" w:themeColor="accent2" w:themeTint="97" w:sz="4" w:space="0"/>
-          <w:bottom w:val="none"/>
-          <w:right w:val="none"/>
+          <w:bottom w:val="none" w:color="000000" w:sz="4" w:space="0"/>
+          <w:right w:val="none" w:color="000000" w:sz="4" w:space="0"/>
         </w:tcBorders>
       </w:tcPr>
     </w:tblStylePr>
@@ -12904,9 +13383,9 @@
         <w:shd w:val="clear" w:color="ffffff" w:themeColor="light1" w:fill="ffffff" w:themeFill="light1"/>
         <w:tcBorders>
           <w:top w:val="single" w:color="000000" w:themeColor="accent2" w:themeTint="97" w:sz="4" w:space="0"/>
-          <w:left w:val="none"/>
-          <w:bottom w:val="none"/>
-          <w:right w:val="none"/>
+          <w:left w:val="none" w:color="000000" w:sz="4" w:space="0"/>
+          <w:bottom w:val="none" w:color="000000" w:sz="4" w:space="0"/>
+          <w:right w:val="none" w:color="000000" w:sz="4" w:space="0"/>
         </w:tcBorders>
       </w:tcPr>
     </w:tblStylePr>
@@ -12976,9 +13455,9 @@
       </w:tcPr>
     </w:tblStylePr>
   </w:style>
-  <w:style w:type="table" w:styleId="64">
+  <w:style w:type="table" w:styleId="755">
     <w:name w:val="Grid Table 7 Colorful - Accent 3"/>
-    <w:basedOn w:val="665"/>
+    <w:basedOn w:val="889"/>
     <w:uiPriority w:val="99"/>
     <w:pPr>
       <w:pBdr/>
@@ -13080,11 +13559,11 @@
         <w:tblBorders/>
       </w:tblPr>
       <w:tcPr>
-        <w:shd w:color="ffffff"/>
+        <w:shd w:val="clear" w:color="ffffff"/>
         <w:tcBorders>
-          <w:top w:val="none"/>
-          <w:left w:val="none"/>
-          <w:bottom w:val="none"/>
+          <w:top w:val="none" w:color="000000" w:sz="4" w:space="0"/>
+          <w:left w:val="none" w:color="000000" w:sz="4" w:space="0"/>
+          <w:bottom w:val="none" w:color="000000" w:sz="4" w:space="0"/>
           <w:right w:val="single" w:color="000000" w:themeColor="accent3" w:themeTint="FE" w:sz="4" w:space="0"/>
         </w:tcBorders>
       </w:tcPr>
@@ -13107,10 +13586,10 @@
       <w:tcPr>
         <w:shd w:val="clear" w:color="ffffff" w:themeColor="light1" w:fill="ffffff" w:themeFill="light1"/>
         <w:tcBorders>
-          <w:top w:val="none"/>
-          <w:left w:val="none"/>
+          <w:top w:val="none" w:color="000000" w:sz="4" w:space="0"/>
+          <w:left w:val="none" w:color="000000" w:sz="4" w:space="0"/>
           <w:bottom w:val="single" w:color="000000" w:themeColor="accent3" w:themeTint="FE" w:sz="4" w:space="0"/>
-          <w:right w:val="none"/>
+          <w:right w:val="none" w:color="000000" w:sz="4" w:space="0"/>
         </w:tcBorders>
       </w:tcPr>
     </w:tblStylePr>
@@ -13130,12 +13609,12 @@
         <w:tblBorders/>
       </w:tblPr>
       <w:tcPr>
-        <w:shd w:color="ffffff"/>
+        <w:shd w:val="clear" w:color="ffffff"/>
         <w:tcBorders>
-          <w:top w:val="none"/>
+          <w:top w:val="none" w:color="000000" w:sz="4" w:space="0"/>
           <w:left w:val="single" w:color="000000" w:themeColor="accent3" w:themeTint="FE" w:sz="4" w:space="0"/>
-          <w:bottom w:val="none"/>
-          <w:right w:val="none"/>
+          <w:bottom w:val="none" w:color="000000" w:sz="4" w:space="0"/>
+          <w:right w:val="none" w:color="000000" w:sz="4" w:space="0"/>
         </w:tcBorders>
       </w:tcPr>
     </w:tblStylePr>
@@ -13158,9 +13637,9 @@
         <w:shd w:val="clear" w:color="ffffff" w:themeColor="light1" w:fill="ffffff" w:themeFill="light1"/>
         <w:tcBorders>
           <w:top w:val="single" w:color="000000" w:themeColor="accent3" w:themeTint="FE" w:sz="4" w:space="0"/>
-          <w:left w:val="none"/>
-          <w:bottom w:val="none"/>
-          <w:right w:val="none"/>
+          <w:left w:val="none" w:color="000000" w:sz="4" w:space="0"/>
+          <w:bottom w:val="none" w:color="000000" w:sz="4" w:space="0"/>
+          <w:right w:val="none" w:color="000000" w:sz="4" w:space="0"/>
         </w:tcBorders>
       </w:tcPr>
     </w:tblStylePr>
@@ -13230,9 +13709,9 @@
       </w:tcPr>
     </w:tblStylePr>
   </w:style>
-  <w:style w:type="table" w:styleId="65">
+  <w:style w:type="table" w:styleId="756">
     <w:name w:val="Grid Table 7 Colorful - Accent 4"/>
-    <w:basedOn w:val="665"/>
+    <w:basedOn w:val="889"/>
     <w:uiPriority w:val="99"/>
     <w:pPr>
       <w:pBdr/>
@@ -13334,11 +13813,11 @@
         <w:tblBorders/>
       </w:tblPr>
       <w:tcPr>
-        <w:shd w:color="ffffff"/>
+        <w:shd w:val="clear" w:color="ffffff"/>
         <w:tcBorders>
-          <w:top w:val="none"/>
-          <w:left w:val="none"/>
-          <w:bottom w:val="none"/>
+          <w:top w:val="none" w:color="000000" w:sz="4" w:space="0"/>
+          <w:left w:val="none" w:color="000000" w:sz="4" w:space="0"/>
+          <w:bottom w:val="none" w:color="000000" w:sz="4" w:space="0"/>
           <w:right w:val="single" w:color="000000" w:themeColor="accent4" w:themeTint="9A" w:sz="4" w:space="0"/>
         </w:tcBorders>
       </w:tcPr>
@@ -13361,10 +13840,10 @@
       <w:tcPr>
         <w:shd w:val="clear" w:color="ffffff" w:themeColor="light1" w:fill="ffffff" w:themeFill="light1"/>
         <w:tcBorders>
-          <w:top w:val="none"/>
-          <w:left w:val="none"/>
+          <w:top w:val="none" w:color="000000" w:sz="4" w:space="0"/>
+          <w:left w:val="none" w:color="000000" w:sz="4" w:space="0"/>
           <w:bottom w:val="single" w:color="000000" w:themeColor="accent4" w:themeTint="9A" w:sz="4" w:space="0"/>
-          <w:right w:val="none"/>
+          <w:right w:val="none" w:color="000000" w:sz="4" w:space="0"/>
         </w:tcBorders>
       </w:tcPr>
     </w:tblStylePr>
@@ -13384,12 +13863,12 @@
         <w:tblBorders/>
       </w:tblPr>
       <w:tcPr>
-        <w:shd w:color="ffffff"/>
+        <w:shd w:val="clear" w:color="ffffff"/>
         <w:tcBorders>
-          <w:top w:val="none"/>
+          <w:top w:val="none" w:color="000000" w:sz="4" w:space="0"/>
           <w:left w:val="single" w:color="000000" w:themeColor="accent4" w:themeTint="9A" w:sz="4" w:space="0"/>
-          <w:bottom w:val="none"/>
-          <w:right w:val="none"/>
+          <w:bottom w:val="none" w:color="000000" w:sz="4" w:space="0"/>
+          <w:right w:val="none" w:color="000000" w:sz="4" w:space="0"/>
         </w:tcBorders>
       </w:tcPr>
     </w:tblStylePr>
@@ -13412,9 +13891,9 @@
         <w:shd w:val="clear" w:color="ffffff" w:themeColor="light1" w:fill="ffffff" w:themeFill="light1"/>
         <w:tcBorders>
           <w:top w:val="single" w:color="000000" w:themeColor="accent4" w:themeTint="9A" w:sz="4" w:space="0"/>
-          <w:left w:val="none"/>
-          <w:bottom w:val="none"/>
-          <w:right w:val="none"/>
+          <w:left w:val="none" w:color="000000" w:sz="4" w:space="0"/>
+          <w:bottom w:val="none" w:color="000000" w:sz="4" w:space="0"/>
+          <w:right w:val="none" w:color="000000" w:sz="4" w:space="0"/>
         </w:tcBorders>
       </w:tcPr>
     </w:tblStylePr>
@@ -13484,9 +13963,9 @@
       </w:tcPr>
     </w:tblStylePr>
   </w:style>
-  <w:style w:type="table" w:styleId="66">
+  <w:style w:type="table" w:styleId="757">
     <w:name w:val="Grid Table 7 Colorful - Accent 5"/>
-    <w:basedOn w:val="665"/>
+    <w:basedOn w:val="889"/>
     <w:uiPriority w:val="99"/>
     <w:pPr>
       <w:pBdr/>
@@ -13588,11 +14067,11 @@
         <w:tblBorders/>
       </w:tblPr>
       <w:tcPr>
-        <w:shd w:color="ffffff"/>
+        <w:shd w:val="clear" w:color="ffffff"/>
         <w:tcBorders>
-          <w:top w:val="none"/>
-          <w:left w:val="none"/>
-          <w:bottom w:val="none"/>
+          <w:top w:val="none" w:color="000000" w:sz="4" w:space="0"/>
+          <w:left w:val="none" w:color="000000" w:sz="4" w:space="0"/>
+          <w:bottom w:val="none" w:color="000000" w:sz="4" w:space="0"/>
           <w:right w:val="single" w:color="000000" w:themeColor="accent5" w:themeTint="90" w:sz="4" w:space="0"/>
         </w:tcBorders>
       </w:tcPr>
@@ -13615,10 +14094,10 @@
       <w:tcPr>
         <w:shd w:val="clear" w:color="ffffff" w:themeColor="light1" w:fill="ffffff" w:themeFill="light1"/>
         <w:tcBorders>
-          <w:top w:val="none"/>
-          <w:left w:val="none"/>
+          <w:top w:val="none" w:color="000000" w:sz="4" w:space="0"/>
+          <w:left w:val="none" w:color="000000" w:sz="4" w:space="0"/>
           <w:bottom w:val="single" w:color="000000" w:themeColor="accent5" w:themeTint="90" w:sz="4" w:space="0"/>
-          <w:right w:val="none"/>
+          <w:right w:val="none" w:color="000000" w:sz="4" w:space="0"/>
         </w:tcBorders>
       </w:tcPr>
     </w:tblStylePr>
@@ -13638,12 +14117,12 @@
         <w:tblBorders/>
       </w:tblPr>
       <w:tcPr>
-        <w:shd w:color="ffffff"/>
+        <w:shd w:val="clear" w:color="ffffff"/>
         <w:tcBorders>
-          <w:top w:val="none"/>
+          <w:top w:val="none" w:color="000000" w:sz="4" w:space="0"/>
           <w:left w:val="single" w:color="000000" w:themeColor="accent5" w:themeTint="90" w:sz="4" w:space="0"/>
-          <w:bottom w:val="none"/>
-          <w:right w:val="none"/>
+          <w:bottom w:val="none" w:color="000000" w:sz="4" w:space="0"/>
+          <w:right w:val="none" w:color="000000" w:sz="4" w:space="0"/>
         </w:tcBorders>
       </w:tcPr>
     </w:tblStylePr>
@@ -13666,9 +14145,9 @@
         <w:shd w:val="clear" w:color="ffffff" w:themeColor="light1" w:fill="ffffff" w:themeFill="light1"/>
         <w:tcBorders>
           <w:top w:val="single" w:color="000000" w:themeColor="accent5" w:themeTint="90" w:sz="4" w:space="0"/>
-          <w:left w:val="none"/>
-          <w:bottom w:val="none"/>
-          <w:right w:val="none"/>
+          <w:left w:val="none" w:color="000000" w:sz="4" w:space="0"/>
+          <w:bottom w:val="none" w:color="000000" w:sz="4" w:space="0"/>
+          <w:right w:val="none" w:color="000000" w:sz="4" w:space="0"/>
         </w:tcBorders>
       </w:tcPr>
     </w:tblStylePr>
@@ -13738,9 +14217,9 @@
       </w:tcPr>
     </w:tblStylePr>
   </w:style>
-  <w:style w:type="table" w:styleId="67">
+  <w:style w:type="table" w:styleId="758">
     <w:name w:val="Grid Table 7 Colorful - Accent 6"/>
-    <w:basedOn w:val="665"/>
+    <w:basedOn w:val="889"/>
     <w:uiPriority w:val="99"/>
     <w:pPr>
       <w:pBdr/>
@@ -13842,11 +14321,11 @@
         <w:tblBorders/>
       </w:tblPr>
       <w:tcPr>
-        <w:shd w:color="ffffff"/>
+        <w:shd w:val="clear" w:color="ffffff"/>
         <w:tcBorders>
-          <w:top w:val="none"/>
-          <w:left w:val="none"/>
-          <w:bottom w:val="none"/>
+          <w:top w:val="none" w:color="000000" w:sz="4" w:space="0"/>
+          <w:left w:val="none" w:color="000000" w:sz="4" w:space="0"/>
+          <w:bottom w:val="none" w:color="000000" w:sz="4" w:space="0"/>
           <w:right w:val="single" w:color="000000" w:themeColor="accent6" w:themeTint="90" w:sz="4" w:space="0"/>
         </w:tcBorders>
       </w:tcPr>
@@ -13869,10 +14348,10 @@
       <w:tcPr>
         <w:shd w:val="clear" w:color="ffffff" w:themeColor="light1" w:fill="ffffff" w:themeFill="light1"/>
         <w:tcBorders>
-          <w:top w:val="none"/>
-          <w:left w:val="none"/>
+          <w:top w:val="none" w:color="000000" w:sz="4" w:space="0"/>
+          <w:left w:val="none" w:color="000000" w:sz="4" w:space="0"/>
           <w:bottom w:val="single" w:color="000000" w:themeColor="accent6" w:themeTint="90" w:sz="4" w:space="0"/>
-          <w:right w:val="none"/>
+          <w:right w:val="none" w:color="000000" w:sz="4" w:space="0"/>
         </w:tcBorders>
       </w:tcPr>
     </w:tblStylePr>
@@ -13892,12 +14371,12 @@
         <w:tblBorders/>
       </w:tblPr>
       <w:tcPr>
-        <w:shd w:color="ffffff"/>
+        <w:shd w:val="clear" w:color="ffffff"/>
         <w:tcBorders>
-          <w:top w:val="none"/>
+          <w:top w:val="none" w:color="000000" w:sz="4" w:space="0"/>
           <w:left w:val="single" w:color="000000" w:themeColor="accent6" w:themeTint="90" w:sz="4" w:space="0"/>
-          <w:bottom w:val="none"/>
-          <w:right w:val="none"/>
+          <w:bottom w:val="none" w:color="000000" w:sz="4" w:space="0"/>
+          <w:right w:val="none" w:color="000000" w:sz="4" w:space="0"/>
         </w:tcBorders>
       </w:tcPr>
     </w:tblStylePr>
@@ -13920,9 +14399,9 @@
         <w:shd w:val="clear" w:color="ffffff" w:themeColor="light1" w:fill="ffffff" w:themeFill="light1"/>
         <w:tcBorders>
           <w:top w:val="single" w:color="000000" w:themeColor="accent6" w:themeTint="90" w:sz="4" w:space="0"/>
-          <w:left w:val="none"/>
-          <w:bottom w:val="none"/>
-          <w:right w:val="none"/>
+          <w:left w:val="none" w:color="000000" w:sz="4" w:space="0"/>
+          <w:bottom w:val="none" w:color="000000" w:sz="4" w:space="0"/>
+          <w:right w:val="none" w:color="000000" w:sz="4" w:space="0"/>
         </w:tcBorders>
       </w:tcPr>
     </w:tblStylePr>
@@ -13992,9 +14471,9 @@
       </w:tcPr>
     </w:tblStylePr>
   </w:style>
-  <w:style w:type="table" w:styleId="68">
+  <w:style w:type="table" w:styleId="759">
     <w:name w:val="List Table 1 Light"/>
-    <w:basedOn w:val="665"/>
+    <w:basedOn w:val="889"/>
     <w:uiPriority w:val="99"/>
     <w:pPr>
       <w:pBdr/>
@@ -14208,9 +14687,9 @@
       </w:tcPr>
     </w:tblStylePr>
   </w:style>
-  <w:style w:type="table" w:styleId="69">
+  <w:style w:type="table" w:styleId="760">
     <w:name w:val="List Table 1 Light - Accent 1"/>
-    <w:basedOn w:val="665"/>
+    <w:basedOn w:val="889"/>
     <w:uiPriority w:val="99"/>
     <w:pPr>
       <w:pBdr/>
@@ -14424,9 +14903,9 @@
       </w:tcPr>
     </w:tblStylePr>
   </w:style>
-  <w:style w:type="table" w:styleId="70">
+  <w:style w:type="table" w:styleId="761">
     <w:name w:val="List Table 1 Light - Accent 2"/>
-    <w:basedOn w:val="665"/>
+    <w:basedOn w:val="889"/>
     <w:uiPriority w:val="99"/>
     <w:pPr>
       <w:pBdr/>
@@ -14640,9 +15119,9 @@
       </w:tcPr>
     </w:tblStylePr>
   </w:style>
-  <w:style w:type="table" w:styleId="71">
+  <w:style w:type="table" w:styleId="762">
     <w:name w:val="List Table 1 Light - Accent 3"/>
-    <w:basedOn w:val="665"/>
+    <w:basedOn w:val="889"/>
     <w:uiPriority w:val="99"/>
     <w:pPr>
       <w:pBdr/>
@@ -14856,9 +15335,9 @@
       </w:tcPr>
     </w:tblStylePr>
   </w:style>
-  <w:style w:type="table" w:styleId="72">
+  <w:style w:type="table" w:styleId="763">
     <w:name w:val="List Table 1 Light - Accent 4"/>
-    <w:basedOn w:val="665"/>
+    <w:basedOn w:val="889"/>
     <w:uiPriority w:val="99"/>
     <w:pPr>
       <w:pBdr/>
@@ -15072,9 +15551,9 @@
       </w:tcPr>
     </w:tblStylePr>
   </w:style>
-  <w:style w:type="table" w:styleId="73">
+  <w:style w:type="table" w:styleId="764">
     <w:name w:val="List Table 1 Light - Accent 5"/>
-    <w:basedOn w:val="665"/>
+    <w:basedOn w:val="889"/>
     <w:uiPriority w:val="99"/>
     <w:pPr>
       <w:pBdr/>
@@ -15288,9 +15767,9 @@
       </w:tcPr>
     </w:tblStylePr>
   </w:style>
-  <w:style w:type="table" w:styleId="74">
+  <w:style w:type="table" w:styleId="765">
     <w:name w:val="List Table 1 Light - Accent 6"/>
-    <w:basedOn w:val="665"/>
+    <w:basedOn w:val="889"/>
     <w:uiPriority w:val="99"/>
     <w:pPr>
       <w:pBdr/>
@@ -15504,9 +15983,9 @@
       </w:tcPr>
     </w:tblStylePr>
   </w:style>
-  <w:style w:type="table" w:styleId="75">
+  <w:style w:type="table" w:styleId="766">
     <w:name w:val="List Table 2"/>
-    <w:basedOn w:val="665"/>
+    <w:basedOn w:val="889"/>
     <w:uiPriority w:val="99"/>
     <w:pPr>
       <w:pBdr/>
@@ -15742,9 +16221,9 @@
       </w:tcPr>
     </w:tblStylePr>
   </w:style>
-  <w:style w:type="table" w:styleId="76">
+  <w:style w:type="table" w:styleId="767">
     <w:name w:val="List Table 2 - Accent 1"/>
-    <w:basedOn w:val="665"/>
+    <w:basedOn w:val="889"/>
     <w:uiPriority w:val="99"/>
     <w:pPr>
       <w:pBdr/>
@@ -15980,9 +16459,9 @@
       </w:tcPr>
     </w:tblStylePr>
   </w:style>
-  <w:style w:type="table" w:styleId="77">
+  <w:style w:type="table" w:styleId="768">
     <w:name w:val="List Table 2 - Accent 2"/>
-    <w:basedOn w:val="665"/>
+    <w:basedOn w:val="889"/>
     <w:uiPriority w:val="99"/>
     <w:pPr>
       <w:pBdr/>
@@ -16218,9 +16697,9 @@
       </w:tcPr>
     </w:tblStylePr>
   </w:style>
-  <w:style w:type="table" w:styleId="78">
+  <w:style w:type="table" w:styleId="769">
     <w:name w:val="List Table 2 - Accent 3"/>
-    <w:basedOn w:val="665"/>
+    <w:basedOn w:val="889"/>
     <w:uiPriority w:val="99"/>
     <w:pPr>
       <w:pBdr/>
@@ -16456,9 +16935,9 @@
       </w:tcPr>
     </w:tblStylePr>
   </w:style>
-  <w:style w:type="table" w:styleId="79">
+  <w:style w:type="table" w:styleId="770">
     <w:name w:val="List Table 2 - Accent 4"/>
-    <w:basedOn w:val="665"/>
+    <w:basedOn w:val="889"/>
     <w:uiPriority w:val="99"/>
     <w:pPr>
       <w:pBdr/>
@@ -16694,9 +17173,9 @@
       </w:tcPr>
     </w:tblStylePr>
   </w:style>
-  <w:style w:type="table" w:styleId="80">
+  <w:style w:type="table" w:styleId="771">
     <w:name w:val="List Table 2 - Accent 5"/>
-    <w:basedOn w:val="665"/>
+    <w:basedOn w:val="889"/>
     <w:uiPriority w:val="99"/>
     <w:pPr>
       <w:pBdr/>
@@ -16932,9 +17411,9 @@
       </w:tcPr>
     </w:tblStylePr>
   </w:style>
-  <w:style w:type="table" w:styleId="81">
+  <w:style w:type="table" w:styleId="772">
     <w:name w:val="List Table 2 - Accent 6"/>
-    <w:basedOn w:val="665"/>
+    <w:basedOn w:val="889"/>
     <w:uiPriority w:val="99"/>
     <w:pPr>
       <w:pBdr/>
@@ -17170,9 +17649,9 @@
       </w:tcPr>
     </w:tblStylePr>
   </w:style>
-  <w:style w:type="table" w:styleId="82">
+  <w:style w:type="table" w:styleId="773">
     <w:name w:val="List Table 3"/>
-    <w:basedOn w:val="665"/>
+    <w:basedOn w:val="889"/>
     <w:uiPriority w:val="99"/>
     <w:pPr>
       <w:pBdr/>
@@ -17398,9 +17877,9 @@
       </w:tcPr>
     </w:tblStylePr>
   </w:style>
-  <w:style w:type="table" w:styleId="83">
+  <w:style w:type="table" w:styleId="774">
     <w:name w:val="List Table 3 - Accent 1"/>
-    <w:basedOn w:val="665"/>
+    <w:basedOn w:val="889"/>
     <w:uiPriority w:val="99"/>
     <w:pPr>
       <w:pBdr/>
@@ -17626,9 +18105,9 @@
       </w:tcPr>
     </w:tblStylePr>
   </w:style>
-  <w:style w:type="table" w:styleId="84">
+  <w:style w:type="table" w:styleId="775">
     <w:name w:val="List Table 3 - Accent 2"/>
-    <w:basedOn w:val="665"/>
+    <w:basedOn w:val="889"/>
     <w:uiPriority w:val="99"/>
     <w:pPr>
       <w:pBdr/>
@@ -17854,9 +18333,9 @@
       </w:tcPr>
     </w:tblStylePr>
   </w:style>
-  <w:style w:type="table" w:styleId="85">
+  <w:style w:type="table" w:styleId="776">
     <w:name w:val="List Table 3 - Accent 3"/>
-    <w:basedOn w:val="665"/>
+    <w:basedOn w:val="889"/>
     <w:uiPriority w:val="99"/>
     <w:pPr>
       <w:pBdr/>
@@ -18082,9 +18561,9 @@
       </w:tcPr>
     </w:tblStylePr>
   </w:style>
-  <w:style w:type="table" w:styleId="86">
+  <w:style w:type="table" w:styleId="777">
     <w:name w:val="List Table 3 - Accent 4"/>
-    <w:basedOn w:val="665"/>
+    <w:basedOn w:val="889"/>
     <w:uiPriority w:val="99"/>
     <w:pPr>
       <w:pBdr/>
@@ -18310,9 +18789,9 @@
       </w:tcPr>
     </w:tblStylePr>
   </w:style>
-  <w:style w:type="table" w:styleId="87">
+  <w:style w:type="table" w:styleId="778">
     <w:name w:val="List Table 3 - Accent 5"/>
-    <w:basedOn w:val="665"/>
+    <w:basedOn w:val="889"/>
     <w:uiPriority w:val="99"/>
     <w:pPr>
       <w:pBdr/>
@@ -18538,9 +19017,9 @@
       </w:tcPr>
     </w:tblStylePr>
   </w:style>
-  <w:style w:type="table" w:styleId="88">
+  <w:style w:type="table" w:styleId="779">
     <w:name w:val="List Table 3 - Accent 6"/>
-    <w:basedOn w:val="665"/>
+    <w:basedOn w:val="889"/>
     <w:uiPriority w:val="99"/>
     <w:pPr>
       <w:pBdr/>
@@ -18766,9 +19245,9 @@
       </w:tcPr>
     </w:tblStylePr>
   </w:style>
-  <w:style w:type="table" w:styleId="89">
+  <w:style w:type="table" w:styleId="780">
     <w:name w:val="List Table 4"/>
-    <w:basedOn w:val="665"/>
+    <w:basedOn w:val="889"/>
     <w:uiPriority w:val="99"/>
     <w:pPr>
       <w:pBdr/>
@@ -18991,9 +19470,9 @@
       </w:tcPr>
     </w:tblStylePr>
   </w:style>
-  <w:style w:type="table" w:styleId="90">
+  <w:style w:type="table" w:styleId="781">
     <w:name w:val="List Table 4 - Accent 1"/>
-    <w:basedOn w:val="665"/>
+    <w:basedOn w:val="889"/>
     <w:uiPriority w:val="99"/>
     <w:pPr>
       <w:pBdr/>
@@ -19216,9 +19695,9 @@
       </w:tcPr>
     </w:tblStylePr>
   </w:style>
-  <w:style w:type="table" w:styleId="91">
+  <w:style w:type="table" w:styleId="782">
     <w:name w:val="List Table 4 - Accent 2"/>
-    <w:basedOn w:val="665"/>
+    <w:basedOn w:val="889"/>
     <w:uiPriority w:val="99"/>
     <w:pPr>
       <w:pBdr/>
@@ -19441,9 +19920,9 @@
       </w:tcPr>
     </w:tblStylePr>
   </w:style>
-  <w:style w:type="table" w:styleId="92">
+  <w:style w:type="table" w:styleId="783">
     <w:name w:val="List Table 4 - Accent 3"/>
-    <w:basedOn w:val="665"/>
+    <w:basedOn w:val="889"/>
     <w:uiPriority w:val="99"/>
     <w:pPr>
       <w:pBdr/>
@@ -19666,9 +20145,9 @@
       </w:tcPr>
     </w:tblStylePr>
   </w:style>
-  <w:style w:type="table" w:styleId="93">
+  <w:style w:type="table" w:styleId="784">
     <w:name w:val="List Table 4 - Accent 4"/>
-    <w:basedOn w:val="665"/>
+    <w:basedOn w:val="889"/>
     <w:uiPriority w:val="99"/>
     <w:pPr>
       <w:pBdr/>
@@ -19891,9 +20370,9 @@
       </w:tcPr>
     </w:tblStylePr>
   </w:style>
-  <w:style w:type="table" w:styleId="94">
+  <w:style w:type="table" w:styleId="785">
     <w:name w:val="List Table 4 - Accent 5"/>
-    <w:basedOn w:val="665"/>
+    <w:basedOn w:val="889"/>
     <w:uiPriority w:val="99"/>
     <w:pPr>
       <w:pBdr/>
@@ -20116,9 +20595,9 @@
       </w:tcPr>
     </w:tblStylePr>
   </w:style>
-  <w:style w:type="table" w:styleId="95">
+  <w:style w:type="table" w:styleId="786">
     <w:name w:val="List Table 4 - Accent 6"/>
-    <w:basedOn w:val="665"/>
+    <w:basedOn w:val="889"/>
     <w:uiPriority w:val="99"/>
     <w:pPr>
       <w:pBdr/>
@@ -20341,9 +20820,9 @@
       </w:tcPr>
     </w:tblStylePr>
   </w:style>
-  <w:style w:type="table" w:styleId="96">
+  <w:style w:type="table" w:styleId="787">
     <w:name w:val="List Table 5 Dark"/>
-    <w:basedOn w:val="665"/>
+    <w:basedOn w:val="889"/>
     <w:uiPriority w:val="99"/>
     <w:pPr>
       <w:pBdr/>
@@ -20583,9 +21062,9 @@
       </w:tcPr>
     </w:tblStylePr>
   </w:style>
-  <w:style w:type="table" w:styleId="97">
+  <w:style w:type="table" w:styleId="788">
     <w:name w:val="List Table 5 Dark - Accent 1"/>
-    <w:basedOn w:val="665"/>
+    <w:basedOn w:val="889"/>
     <w:uiPriority w:val="99"/>
     <w:pPr>
       <w:pBdr/>
@@ -20825,9 +21304,9 @@
       </w:tcPr>
     </w:tblStylePr>
   </w:style>
-  <w:style w:type="table" w:styleId="98">
+  <w:style w:type="table" w:styleId="789">
     <w:name w:val="List Table 5 Dark - Accent 2"/>
-    <w:basedOn w:val="665"/>
+    <w:basedOn w:val="889"/>
     <w:uiPriority w:val="99"/>
     <w:pPr>
       <w:pBdr/>
@@ -21067,9 +21546,9 @@
       </w:tcPr>
     </w:tblStylePr>
   </w:style>
-  <w:style w:type="table" w:styleId="99">
+  <w:style w:type="table" w:styleId="790">
     <w:name w:val="List Table 5 Dark - Accent 3"/>
-    <w:basedOn w:val="665"/>
+    <w:basedOn w:val="889"/>
     <w:uiPriority w:val="99"/>
     <w:pPr>
       <w:pBdr/>
@@ -21309,9 +21788,9 @@
       </w:tcPr>
     </w:tblStylePr>
   </w:style>
-  <w:style w:type="table" w:styleId="100">
+  <w:style w:type="table" w:styleId="791">
     <w:name w:val="List Table 5 Dark - Accent 4"/>
-    <w:basedOn w:val="665"/>
+    <w:basedOn w:val="889"/>
     <w:uiPriority w:val="99"/>
     <w:pPr>
       <w:pBdr/>
@@ -21551,9 +22030,9 @@
       </w:tcPr>
     </w:tblStylePr>
   </w:style>
-  <w:style w:type="table" w:styleId="101">
+  <w:style w:type="table" w:styleId="792">
     <w:name w:val="List Table 5 Dark - Accent 5"/>
-    <w:basedOn w:val="665"/>
+    <w:basedOn w:val="889"/>
     <w:uiPriority w:val="99"/>
     <w:pPr>
       <w:pBdr/>
@@ -21793,9 +22272,9 @@
       </w:tcPr>
     </w:tblStylePr>
   </w:style>
-  <w:style w:type="table" w:styleId="102">
+  <w:style w:type="table" w:styleId="793">
     <w:name w:val="List Table 5 Dark - Accent 6"/>
-    <w:basedOn w:val="665"/>
+    <w:basedOn w:val="889"/>
     <w:uiPriority w:val="99"/>
     <w:pPr>
       <w:pBdr/>
@@ -22035,9 +22514,9 @@
       </w:tcPr>
     </w:tblStylePr>
   </w:style>
-  <w:style w:type="table" w:styleId="103">
+  <w:style w:type="table" w:styleId="794">
     <w:name w:val="List Table 6 Colorful"/>
-    <w:basedOn w:val="665"/>
+    <w:basedOn w:val="889"/>
     <w:uiPriority w:val="99"/>
     <w:pPr>
       <w:pBdr/>
@@ -22258,9 +22737,9 @@
       </w:tcPr>
     </w:tblStylePr>
   </w:style>
-  <w:style w:type="table" w:styleId="104">
+  <w:style w:type="table" w:styleId="795">
     <w:name w:val="List Table 6 Colorful - Accent 1"/>
-    <w:basedOn w:val="665"/>
+    <w:basedOn w:val="889"/>
     <w:uiPriority w:val="99"/>
     <w:pPr>
       <w:pBdr/>
@@ -22481,9 +22960,9 @@
       </w:tcPr>
     </w:tblStylePr>
   </w:style>
-  <w:style w:type="table" w:styleId="105">
+  <w:style w:type="table" w:styleId="796">
     <w:name w:val="List Table 6 Colorful - Accent 2"/>
-    <w:basedOn w:val="665"/>
+    <w:basedOn w:val="889"/>
     <w:uiPriority w:val="99"/>
     <w:pPr>
       <w:pBdr/>
@@ -22704,9 +23183,9 @@
       </w:tcPr>
     </w:tblStylePr>
   </w:style>
-  <w:style w:type="table" w:styleId="106">
+  <w:style w:type="table" w:styleId="797">
     <w:name w:val="List Table 6 Colorful - Accent 3"/>
-    <w:basedOn w:val="665"/>
+    <w:basedOn w:val="889"/>
     <w:uiPriority w:val="99"/>
     <w:pPr>
       <w:pBdr/>
@@ -22927,9 +23406,9 @@
       </w:tcPr>
     </w:tblStylePr>
   </w:style>
-  <w:style w:type="table" w:styleId="107">
+  <w:style w:type="table" w:styleId="798">
     <w:name w:val="List Table 6 Colorful - Accent 4"/>
-    <w:basedOn w:val="665"/>
+    <w:basedOn w:val="889"/>
     <w:uiPriority w:val="99"/>
     <w:pPr>
       <w:pBdr/>
@@ -23150,9 +23629,9 @@
       </w:tcPr>
     </w:tblStylePr>
   </w:style>
-  <w:style w:type="table" w:styleId="108">
+  <w:style w:type="table" w:styleId="799">
     <w:name w:val="List Table 6 Colorful - Accent 5"/>
-    <w:basedOn w:val="665"/>
+    <w:basedOn w:val="889"/>
     <w:uiPriority w:val="99"/>
     <w:pPr>
       <w:pBdr/>
@@ -23373,9 +23852,9 @@
       </w:tcPr>
     </w:tblStylePr>
   </w:style>
-  <w:style w:type="table" w:styleId="109">
+  <w:style w:type="table" w:styleId="800">
     <w:name w:val="List Table 6 Colorful - Accent 6"/>
-    <w:basedOn w:val="665"/>
+    <w:basedOn w:val="889"/>
     <w:uiPriority w:val="99"/>
     <w:pPr>
       <w:pBdr/>
@@ -23596,9 +24075,9 @@
       </w:tcPr>
     </w:tblStylePr>
   </w:style>
-  <w:style w:type="table" w:styleId="110">
+  <w:style w:type="table" w:styleId="801">
     <w:name w:val="List Table 7 Colorful"/>
-    <w:basedOn w:val="665"/>
+    <w:basedOn w:val="889"/>
     <w:uiPriority w:val="99"/>
     <w:pPr>
       <w:pBdr/>
@@ -23697,11 +24176,11 @@
         <w:tblBorders/>
       </w:tblPr>
       <w:tcPr>
-        <w:shd w:color="ffffff"/>
+        <w:shd w:val="clear" w:color="ffffff"/>
         <w:tcBorders>
-          <w:top w:val="none"/>
-          <w:left w:val="none"/>
-          <w:bottom w:val="none"/>
+          <w:top w:val="none" w:color="000000" w:sz="4" w:space="0"/>
+          <w:left w:val="none" w:color="000000" w:sz="4" w:space="0"/>
+          <w:bottom w:val="none" w:color="000000" w:sz="4" w:space="0"/>
           <w:right w:val="single" w:color="000000" w:themeColor="text1" w:themeTint="80" w:sz="4" w:space="0"/>
         </w:tcBorders>
       </w:tcPr>
@@ -23724,10 +24203,10 @@
       <w:tcPr>
         <w:shd w:val="clear" w:color="ffffff" w:themeColor="light1" w:fill="ffffff" w:themeFill="light1"/>
         <w:tcBorders>
-          <w:top w:val="none"/>
-          <w:left w:val="none"/>
+          <w:top w:val="none" w:color="000000" w:sz="4" w:space="0"/>
+          <w:left w:val="none" w:color="000000" w:sz="4" w:space="0"/>
           <w:bottom w:val="single" w:color="000000" w:themeColor="text1" w:themeTint="80" w:sz="4" w:space="0"/>
-          <w:right w:val="none"/>
+          <w:right w:val="none" w:color="000000" w:sz="4" w:space="0"/>
         </w:tcBorders>
       </w:tcPr>
     </w:tblStylePr>
@@ -23747,12 +24226,12 @@
         <w:tblBorders/>
       </w:tblPr>
       <w:tcPr>
-        <w:shd w:color="ffffff"/>
+        <w:shd w:val="clear" w:color="ffffff"/>
         <w:tcBorders>
-          <w:top w:val="none"/>
+          <w:top w:val="none" w:color="000000" w:sz="4" w:space="0"/>
           <w:left w:val="single" w:color="000000" w:themeColor="text1" w:themeTint="80" w:sz="4" w:space="0"/>
-          <w:bottom w:val="none"/>
-          <w:right w:val="none"/>
+          <w:bottom w:val="none" w:color="000000" w:sz="4" w:space="0"/>
+          <w:right w:val="none" w:color="000000" w:sz="4" w:space="0"/>
         </w:tcBorders>
       </w:tcPr>
     </w:tblStylePr>
@@ -23775,9 +24254,9 @@
         <w:shd w:val="clear" w:color="ffffff" w:themeColor="light1" w:fill="ffffff" w:themeFill="light1"/>
         <w:tcBorders>
           <w:top w:val="single" w:color="000000" w:themeColor="text1" w:themeTint="80" w:sz="4" w:space="0"/>
-          <w:left w:val="none"/>
-          <w:bottom w:val="none"/>
-          <w:right w:val="none"/>
+          <w:left w:val="none" w:color="000000" w:sz="4" w:space="0"/>
+          <w:bottom w:val="none" w:color="000000" w:sz="4" w:space="0"/>
+          <w:right w:val="none" w:color="000000" w:sz="4" w:space="0"/>
         </w:tcBorders>
       </w:tcPr>
     </w:tblStylePr>
@@ -23852,9 +24331,9 @@
       </w:tcPr>
     </w:tblStylePr>
   </w:style>
-  <w:style w:type="table" w:styleId="111">
+  <w:style w:type="table" w:styleId="802">
     <w:name w:val="List Table 7 Colorful - Accent 1"/>
-    <w:basedOn w:val="665"/>
+    <w:basedOn w:val="889"/>
     <w:uiPriority w:val="99"/>
     <w:pPr>
       <w:pBdr/>
@@ -23953,11 +24432,11 @@
         <w:tblBorders/>
       </w:tblPr>
       <w:tcPr>
-        <w:shd w:color="ffffff"/>
+        <w:shd w:val="clear" w:color="ffffff"/>
         <w:tcBorders>
-          <w:top w:val="none"/>
-          <w:left w:val="none"/>
-          <w:bottom w:val="none"/>
+          <w:top w:val="none" w:color="000000" w:sz="4" w:space="0"/>
+          <w:left w:val="none" w:color="000000" w:sz="4" w:space="0"/>
+          <w:bottom w:val="none" w:color="000000" w:sz="4" w:space="0"/>
           <w:right w:val="single" w:color="000000" w:themeColor="accent1" w:sz="4" w:space="0"/>
         </w:tcBorders>
       </w:tcPr>
@@ -23980,10 +24459,10 @@
       <w:tcPr>
         <w:shd w:val="clear" w:color="ffffff" w:themeColor="light1" w:fill="ffffff" w:themeFill="light1"/>
         <w:tcBorders>
-          <w:top w:val="none"/>
-          <w:left w:val="none"/>
+          <w:top w:val="none" w:color="000000" w:sz="4" w:space="0"/>
+          <w:left w:val="none" w:color="000000" w:sz="4" w:space="0"/>
           <w:bottom w:val="single" w:color="000000" w:themeColor="accent1" w:sz="4" w:space="0"/>
-          <w:right w:val="none"/>
+          <w:right w:val="none" w:color="000000" w:sz="4" w:space="0"/>
         </w:tcBorders>
       </w:tcPr>
     </w:tblStylePr>
@@ -24003,12 +24482,12 @@
         <w:tblBorders/>
       </w:tblPr>
       <w:tcPr>
-        <w:shd w:color="ffffff"/>
+        <w:shd w:val="clear" w:color="ffffff"/>
         <w:tcBorders>
-          <w:top w:val="none"/>
+          <w:top w:val="none" w:color="000000" w:sz="4" w:space="0"/>
           <w:left w:val="single" w:color="000000" w:themeColor="accent1" w:sz="4" w:space="0"/>
-          <w:bottom w:val="none"/>
-          <w:right w:val="none"/>
+          <w:bottom w:val="none" w:color="000000" w:sz="4" w:space="0"/>
+          <w:right w:val="none" w:color="000000" w:sz="4" w:space="0"/>
         </w:tcBorders>
       </w:tcPr>
     </w:tblStylePr>
@@ -24031,9 +24510,9 @@
         <w:shd w:val="clear" w:color="ffffff" w:themeColor="light1" w:fill="ffffff" w:themeFill="light1"/>
         <w:tcBorders>
           <w:top w:val="single" w:color="000000" w:themeColor="accent1" w:sz="4" w:space="0"/>
-          <w:left w:val="none"/>
-          <w:bottom w:val="none"/>
-          <w:right w:val="none"/>
+          <w:left w:val="none" w:color="000000" w:sz="4" w:space="0"/>
+          <w:bottom w:val="none" w:color="000000" w:sz="4" w:space="0"/>
+          <w:right w:val="none" w:color="000000" w:sz="4" w:space="0"/>
         </w:tcBorders>
       </w:tcPr>
     </w:tblStylePr>
@@ -24108,9 +24587,9 @@
       </w:tcPr>
     </w:tblStylePr>
   </w:style>
-  <w:style w:type="table" w:styleId="112">
+  <w:style w:type="table" w:styleId="803">
     <w:name w:val="List Table 7 Colorful - Accent 2"/>
-    <w:basedOn w:val="665"/>
+    <w:basedOn w:val="889"/>
     <w:uiPriority w:val="99"/>
     <w:pPr>
       <w:pBdr/>
@@ -24209,11 +24688,11 @@
         <w:tblBorders/>
       </w:tblPr>
       <w:tcPr>
-        <w:shd w:color="ffffff"/>
+        <w:shd w:val="clear" w:color="ffffff"/>
         <w:tcBorders>
-          <w:top w:val="none"/>
-          <w:left w:val="none"/>
-          <w:bottom w:val="none"/>
+          <w:top w:val="none" w:color="000000" w:sz="4" w:space="0"/>
+          <w:left w:val="none" w:color="000000" w:sz="4" w:space="0"/>
+          <w:bottom w:val="none" w:color="000000" w:sz="4" w:space="0"/>
           <w:right w:val="single" w:color="000000" w:themeColor="accent2" w:themeTint="97" w:sz="4" w:space="0"/>
         </w:tcBorders>
       </w:tcPr>
@@ -24236,10 +24715,10 @@
       <w:tcPr>
         <w:shd w:val="clear" w:color="ffffff" w:themeColor="light1" w:fill="ffffff" w:themeFill="light1"/>
         <w:tcBorders>
-          <w:top w:val="none"/>
-          <w:left w:val="none"/>
+          <w:top w:val="none" w:color="000000" w:sz="4" w:space="0"/>
+          <w:left w:val="none" w:color="000000" w:sz="4" w:space="0"/>
           <w:bottom w:val="single" w:color="000000" w:themeColor="accent2" w:themeTint="97" w:sz="4" w:space="0"/>
-          <w:right w:val="none"/>
+          <w:right w:val="none" w:color="000000" w:sz="4" w:space="0"/>
         </w:tcBorders>
       </w:tcPr>
     </w:tblStylePr>
@@ -24259,12 +24738,12 @@
         <w:tblBorders/>
       </w:tblPr>
       <w:tcPr>
-        <w:shd w:color="ffffff"/>
+        <w:shd w:val="clear" w:color="ffffff"/>
         <w:tcBorders>
-          <w:top w:val="none"/>
+          <w:top w:val="none" w:color="000000" w:sz="4" w:space="0"/>
           <w:left w:val="single" w:color="000000" w:themeColor="accent2" w:themeTint="97" w:sz="4" w:space="0"/>
-          <w:bottom w:val="none"/>
-          <w:right w:val="none"/>
+          <w:bottom w:val="none" w:color="000000" w:sz="4" w:space="0"/>
+          <w:right w:val="none" w:color="000000" w:sz="4" w:space="0"/>
         </w:tcBorders>
       </w:tcPr>
     </w:tblStylePr>
@@ -24287,9 +24766,9 @@
         <w:shd w:val="clear" w:color="ffffff" w:themeColor="light1" w:fill="ffffff" w:themeFill="light1"/>
         <w:tcBorders>
           <w:top w:val="single" w:color="000000" w:themeColor="accent2" w:themeTint="97" w:sz="4" w:space="0"/>
-          <w:left w:val="none"/>
-          <w:bottom w:val="none"/>
-          <w:right w:val="none"/>
+          <w:left w:val="none" w:color="000000" w:sz="4" w:space="0"/>
+          <w:bottom w:val="none" w:color="000000" w:sz="4" w:space="0"/>
+          <w:right w:val="none" w:color="000000" w:sz="4" w:space="0"/>
         </w:tcBorders>
       </w:tcPr>
     </w:tblStylePr>
@@ -24364,9 +24843,9 @@
       </w:tcPr>
     </w:tblStylePr>
   </w:style>
-  <w:style w:type="table" w:styleId="113">
+  <w:style w:type="table" w:styleId="804">
     <w:name w:val="List Table 7 Colorful - Accent 3"/>
-    <w:basedOn w:val="665"/>
+    <w:basedOn w:val="889"/>
     <w:uiPriority w:val="99"/>
     <w:pPr>
       <w:pBdr/>
@@ -24465,11 +24944,11 @@
         <w:tblBorders/>
       </w:tblPr>
       <w:tcPr>
-        <w:shd w:color="ffffff"/>
+        <w:shd w:val="clear" w:color="ffffff"/>
         <w:tcBorders>
-          <w:top w:val="none"/>
-          <w:left w:val="none"/>
-          <w:bottom w:val="none"/>
+          <w:top w:val="none" w:color="000000" w:sz="4" w:space="0"/>
+          <w:left w:val="none" w:color="000000" w:sz="4" w:space="0"/>
+          <w:bottom w:val="none" w:color="000000" w:sz="4" w:space="0"/>
           <w:right w:val="single" w:color="000000" w:themeColor="accent3" w:themeTint="98" w:sz="4" w:space="0"/>
         </w:tcBorders>
       </w:tcPr>
@@ -24492,10 +24971,10 @@
       <w:tcPr>
         <w:shd w:val="clear" w:color="ffffff" w:themeColor="light1" w:fill="ffffff" w:themeFill="light1"/>
         <w:tcBorders>
-          <w:top w:val="none"/>
-          <w:left w:val="none"/>
+          <w:top w:val="none" w:color="000000" w:sz="4" w:space="0"/>
+          <w:left w:val="none" w:color="000000" w:sz="4" w:space="0"/>
           <w:bottom w:val="single" w:color="000000" w:themeColor="accent3" w:themeTint="98" w:sz="4" w:space="0"/>
-          <w:right w:val="none"/>
+          <w:right w:val="none" w:color="000000" w:sz="4" w:space="0"/>
         </w:tcBorders>
       </w:tcPr>
     </w:tblStylePr>
@@ -24515,12 +24994,12 @@
         <w:tblBorders/>
       </w:tblPr>
       <w:tcPr>
-        <w:shd w:color="ffffff"/>
+        <w:shd w:val="clear" w:color="ffffff"/>
         <w:tcBorders>
-          <w:top w:val="none"/>
+          <w:top w:val="none" w:color="000000" w:sz="4" w:space="0"/>
           <w:left w:val="single" w:color="000000" w:themeColor="accent3" w:themeTint="98" w:sz="4" w:space="0"/>
-          <w:bottom w:val="none"/>
-          <w:right w:val="none"/>
+          <w:bottom w:val="none" w:color="000000" w:sz="4" w:space="0"/>
+          <w:right w:val="none" w:color="000000" w:sz="4" w:space="0"/>
         </w:tcBorders>
       </w:tcPr>
     </w:tblStylePr>
@@ -24543,9 +25022,9 @@
         <w:shd w:val="clear" w:color="ffffff" w:themeColor="light1" w:fill="ffffff" w:themeFill="light1"/>
         <w:tcBorders>
           <w:top w:val="single" w:color="000000" w:themeColor="accent3" w:themeTint="98" w:sz="4" w:space="0"/>
-          <w:left w:val="none"/>
-          <w:bottom w:val="none"/>
-          <w:right w:val="none"/>
+          <w:left w:val="none" w:color="000000" w:sz="4" w:space="0"/>
+          <w:bottom w:val="none" w:color="000000" w:sz="4" w:space="0"/>
+          <w:right w:val="none" w:color="000000" w:sz="4" w:space="0"/>
         </w:tcBorders>
       </w:tcPr>
     </w:tblStylePr>
@@ -24620,9 +25099,9 @@
       </w:tcPr>
     </w:tblStylePr>
   </w:style>
-  <w:style w:type="table" w:styleId="114">
+  <w:style w:type="table" w:styleId="805">
     <w:name w:val="List Table 7 Colorful - Accent 4"/>
-    <w:basedOn w:val="665"/>
+    <w:basedOn w:val="889"/>
     <w:uiPriority w:val="99"/>
     <w:pPr>
       <w:pBdr/>
@@ -24721,11 +25200,11 @@
         <w:tblBorders/>
       </w:tblPr>
       <w:tcPr>
-        <w:shd w:color="ffffff"/>
+        <w:shd w:val="clear" w:color="ffffff"/>
         <w:tcBorders>
-          <w:top w:val="none"/>
-          <w:left w:val="none"/>
-          <w:bottom w:val="none"/>
+          <w:top w:val="none" w:color="000000" w:sz="4" w:space="0"/>
+          <w:left w:val="none" w:color="000000" w:sz="4" w:space="0"/>
+          <w:bottom w:val="none" w:color="000000" w:sz="4" w:space="0"/>
           <w:right w:val="single" w:color="000000" w:themeColor="accent4" w:themeTint="9A" w:sz="4" w:space="0"/>
         </w:tcBorders>
       </w:tcPr>
@@ -24748,10 +25227,10 @@
       <w:tcPr>
         <w:shd w:val="clear" w:color="ffffff" w:themeColor="light1" w:fill="ffffff" w:themeFill="light1"/>
         <w:tcBorders>
-          <w:top w:val="none"/>
-          <w:left w:val="none"/>
+          <w:top w:val="none" w:color="000000" w:sz="4" w:space="0"/>
+          <w:left w:val="none" w:color="000000" w:sz="4" w:space="0"/>
           <w:bottom w:val="single" w:color="000000" w:themeColor="accent4" w:themeTint="9A" w:sz="4" w:space="0"/>
-          <w:right w:val="none"/>
+          <w:right w:val="none" w:color="000000" w:sz="4" w:space="0"/>
         </w:tcBorders>
       </w:tcPr>
     </w:tblStylePr>
@@ -24771,12 +25250,12 @@
         <w:tblBorders/>
       </w:tblPr>
       <w:tcPr>
-        <w:shd w:color="ffffff"/>
+        <w:shd w:val="clear" w:color="ffffff"/>
         <w:tcBorders>
-          <w:top w:val="none"/>
+          <w:top w:val="none" w:color="000000" w:sz="4" w:space="0"/>
           <w:left w:val="single" w:color="000000" w:themeColor="accent4" w:themeTint="9A" w:sz="4" w:space="0"/>
-          <w:bottom w:val="none"/>
-          <w:right w:val="none"/>
+          <w:bottom w:val="none" w:color="000000" w:sz="4" w:space="0"/>
+          <w:right w:val="none" w:color="000000" w:sz="4" w:space="0"/>
         </w:tcBorders>
       </w:tcPr>
     </w:tblStylePr>
@@ -24799,9 +25278,9 @@
         <w:shd w:val="clear" w:color="ffffff" w:themeColor="light1" w:fill="ffffff" w:themeFill="light1"/>
         <w:tcBorders>
           <w:top w:val="single" w:color="000000" w:themeColor="accent4" w:themeTint="9A" w:sz="4" w:space="0"/>
-          <w:left w:val="none"/>
-          <w:bottom w:val="none"/>
-          <w:right w:val="none"/>
+          <w:left w:val="none" w:color="000000" w:sz="4" w:space="0"/>
+          <w:bottom w:val="none" w:color="000000" w:sz="4" w:space="0"/>
+          <w:right w:val="none" w:color="000000" w:sz="4" w:space="0"/>
         </w:tcBorders>
       </w:tcPr>
     </w:tblStylePr>
@@ -24876,9 +25355,9 @@
       </w:tcPr>
     </w:tblStylePr>
   </w:style>
-  <w:style w:type="table" w:styleId="115">
+  <w:style w:type="table" w:styleId="806">
     <w:name w:val="List Table 7 Colorful - Accent 5"/>
-    <w:basedOn w:val="665"/>
+    <w:basedOn w:val="889"/>
     <w:uiPriority w:val="99"/>
     <w:pPr>
       <w:pBdr/>
@@ -24977,11 +25456,11 @@
         <w:tblBorders/>
       </w:tblPr>
       <w:tcPr>
-        <w:shd w:color="ffffff"/>
+        <w:shd w:val="clear" w:color="ffffff"/>
         <w:tcBorders>
-          <w:top w:val="none"/>
-          <w:left w:val="none"/>
-          <w:bottom w:val="none"/>
+          <w:top w:val="none" w:color="000000" w:sz="4" w:space="0"/>
+          <w:left w:val="none" w:color="000000" w:sz="4" w:space="0"/>
+          <w:bottom w:val="none" w:color="000000" w:sz="4" w:space="0"/>
           <w:right w:val="single" w:color="000000" w:themeColor="accent5" w:themeTint="9A" w:sz="4" w:space="0"/>
         </w:tcBorders>
       </w:tcPr>
@@ -25004,10 +25483,10 @@
       <w:tcPr>
         <w:shd w:val="clear" w:color="ffffff" w:themeColor="light1" w:fill="ffffff" w:themeFill="light1"/>
         <w:tcBorders>
-          <w:top w:val="none"/>
-          <w:left w:val="none"/>
+          <w:top w:val="none" w:color="000000" w:sz="4" w:space="0"/>
+          <w:left w:val="none" w:color="000000" w:sz="4" w:space="0"/>
           <w:bottom w:val="single" w:color="000000" w:themeColor="accent5" w:themeTint="9A" w:sz="4" w:space="0"/>
-          <w:right w:val="none"/>
+          <w:right w:val="none" w:color="000000" w:sz="4" w:space="0"/>
         </w:tcBorders>
       </w:tcPr>
     </w:tblStylePr>
@@ -25027,12 +25506,12 @@
         <w:tblBorders/>
       </w:tblPr>
       <w:tcPr>
-        <w:shd w:color="ffffff"/>
+        <w:shd w:val="clear" w:color="ffffff"/>
         <w:tcBorders>
-          <w:top w:val="none"/>
+          <w:top w:val="none" w:color="000000" w:sz="4" w:space="0"/>
           <w:left w:val="single" w:color="000000" w:themeColor="accent5" w:themeTint="9A" w:sz="4" w:space="0"/>
-          <w:bottom w:val="none"/>
-          <w:right w:val="none"/>
+          <w:bottom w:val="none" w:color="000000" w:sz="4" w:space="0"/>
+          <w:right w:val="none" w:color="000000" w:sz="4" w:space="0"/>
         </w:tcBorders>
       </w:tcPr>
     </w:tblStylePr>
@@ -25055,9 +25534,9 @@
         <w:shd w:val="clear" w:color="ffffff" w:themeColor="light1" w:fill="ffffff" w:themeFill="light1"/>
         <w:tcBorders>
           <w:top w:val="single" w:color="000000" w:themeColor="accent5" w:themeTint="9A" w:sz="4" w:space="0"/>
-          <w:left w:val="none"/>
-          <w:bottom w:val="none"/>
-          <w:right w:val="none"/>
+          <w:left w:val="none" w:color="000000" w:sz="4" w:space="0"/>
+          <w:bottom w:val="none" w:color="000000" w:sz="4" w:space="0"/>
+          <w:right w:val="none" w:color="000000" w:sz="4" w:space="0"/>
         </w:tcBorders>
       </w:tcPr>
     </w:tblStylePr>
@@ -25132,9 +25611,9 @@
       </w:tcPr>
     </w:tblStylePr>
   </w:style>
-  <w:style w:type="table" w:styleId="116">
+  <w:style w:type="table" w:styleId="807">
     <w:name w:val="List Table 7 Colorful - Accent 6"/>
-    <w:basedOn w:val="665"/>
+    <w:basedOn w:val="889"/>
     <w:uiPriority w:val="99"/>
     <w:pPr>
       <w:pBdr/>
@@ -25233,11 +25712,11 @@
         <w:tblBorders/>
       </w:tblPr>
       <w:tcPr>
-        <w:shd w:color="ffffff"/>
+        <w:shd w:val="clear" w:color="ffffff"/>
         <w:tcBorders>
-          <w:top w:val="none"/>
-          <w:left w:val="none"/>
-          <w:bottom w:val="none"/>
+          <w:top w:val="none" w:color="000000" w:sz="4" w:space="0"/>
+          <w:left w:val="none" w:color="000000" w:sz="4" w:space="0"/>
+          <w:bottom w:val="none" w:color="000000" w:sz="4" w:space="0"/>
           <w:right w:val="single" w:color="000000" w:themeColor="accent6" w:themeTint="98" w:sz="4" w:space="0"/>
         </w:tcBorders>
       </w:tcPr>
@@ -25260,10 +25739,10 @@
       <w:tcPr>
         <w:shd w:val="clear" w:color="ffffff" w:themeColor="light1" w:fill="ffffff" w:themeFill="light1"/>
         <w:tcBorders>
-          <w:top w:val="none"/>
-          <w:left w:val="none"/>
+          <w:top w:val="none" w:color="000000" w:sz="4" w:space="0"/>
+          <w:left w:val="none" w:color="000000" w:sz="4" w:space="0"/>
           <w:bottom w:val="single" w:color="000000" w:themeColor="accent6" w:themeTint="98" w:sz="4" w:space="0"/>
-          <w:right w:val="none"/>
+          <w:right w:val="none" w:color="000000" w:sz="4" w:space="0"/>
         </w:tcBorders>
       </w:tcPr>
     </w:tblStylePr>
@@ -25283,12 +25762,12 @@
         <w:tblBorders/>
       </w:tblPr>
       <w:tcPr>
-        <w:shd w:color="ffffff"/>
+        <w:shd w:val="clear" w:color="ffffff"/>
         <w:tcBorders>
-          <w:top w:val="none"/>
+          <w:top w:val="none" w:color="000000" w:sz="4" w:space="0"/>
           <w:left w:val="single" w:color="000000" w:themeColor="accent6" w:themeTint="98" w:sz="4" w:space="0"/>
-          <w:bottom w:val="none"/>
-          <w:right w:val="none"/>
+          <w:bottom w:val="none" w:color="000000" w:sz="4" w:space="0"/>
+          <w:right w:val="none" w:color="000000" w:sz="4" w:space="0"/>
         </w:tcBorders>
       </w:tcPr>
     </w:tblStylePr>
@@ -25311,9 +25790,9 @@
         <w:shd w:val="clear" w:color="ffffff" w:themeColor="light1" w:fill="ffffff" w:themeFill="light1"/>
         <w:tcBorders>
           <w:top w:val="single" w:color="000000" w:themeColor="accent6" w:themeTint="98" w:sz="4" w:space="0"/>
-          <w:left w:val="none"/>
-          <w:bottom w:val="none"/>
-          <w:right w:val="none"/>
+          <w:left w:val="none" w:color="000000" w:sz="4" w:space="0"/>
+          <w:bottom w:val="none" w:color="000000" w:sz="4" w:space="0"/>
+          <w:right w:val="none" w:color="000000" w:sz="4" w:space="0"/>
         </w:tcBorders>
       </w:tcPr>
     </w:tblStylePr>
@@ -25388,9 +25867,9 @@
       </w:tcPr>
     </w:tblStylePr>
   </w:style>
-  <w:style w:type="table" w:styleId="117">
+  <w:style w:type="table" w:styleId="808">
     <w:name w:val="Lined - Accent"/>
-    <w:basedOn w:val="665"/>
+    <w:basedOn w:val="889"/>
     <w:uiPriority w:val="99"/>
     <w:pPr>
       <w:pBdr/>
@@ -25625,9 +26104,9 @@
       </w:tcPr>
     </w:tblStylePr>
   </w:style>
-  <w:style w:type="table" w:styleId="118">
+  <w:style w:type="table" w:styleId="809">
     <w:name w:val="Lined - Accent 1"/>
-    <w:basedOn w:val="665"/>
+    <w:basedOn w:val="889"/>
     <w:uiPriority w:val="99"/>
     <w:pPr>
       <w:pBdr/>
@@ -25862,9 +26341,9 @@
       </w:tcPr>
     </w:tblStylePr>
   </w:style>
-  <w:style w:type="table" w:styleId="119">
+  <w:style w:type="table" w:styleId="810">
     <w:name w:val="Lined - Accent 2"/>
-    <w:basedOn w:val="665"/>
+    <w:basedOn w:val="889"/>
     <w:uiPriority w:val="99"/>
     <w:pPr>
       <w:pBdr/>
@@ -26099,9 +26578,9 @@
       </w:tcPr>
     </w:tblStylePr>
   </w:style>
-  <w:style w:type="table" w:styleId="120">
+  <w:style w:type="table" w:styleId="811">
     <w:name w:val="Lined - Accent 3"/>
-    <w:basedOn w:val="665"/>
+    <w:basedOn w:val="889"/>
     <w:uiPriority w:val="99"/>
     <w:pPr>
       <w:pBdr/>
@@ -26336,9 +26815,9 @@
       </w:tcPr>
     </w:tblStylePr>
   </w:style>
-  <w:style w:type="table" w:styleId="121">
+  <w:style w:type="table" w:styleId="812">
     <w:name w:val="Lined - Accent 4"/>
-    <w:basedOn w:val="665"/>
+    <w:basedOn w:val="889"/>
     <w:uiPriority w:val="99"/>
     <w:pPr>
       <w:pBdr/>
@@ -26573,9 +27052,9 @@
       </w:tcPr>
     </w:tblStylePr>
   </w:style>
-  <w:style w:type="table" w:styleId="122">
+  <w:style w:type="table" w:styleId="813">
     <w:name w:val="Lined - Accent 5"/>
-    <w:basedOn w:val="665"/>
+    <w:basedOn w:val="889"/>
     <w:uiPriority w:val="99"/>
     <w:pPr>
       <w:pBdr/>
@@ -26810,9 +27289,9 @@
       </w:tcPr>
     </w:tblStylePr>
   </w:style>
-  <w:style w:type="table" w:styleId="123">
+  <w:style w:type="table" w:styleId="814">
     <w:name w:val="Lined - Accent 6"/>
-    <w:basedOn w:val="665"/>
+    <w:basedOn w:val="889"/>
     <w:uiPriority w:val="99"/>
     <w:pPr>
       <w:pBdr/>
@@ -27047,9 +27526,9 @@
       </w:tcPr>
     </w:tblStylePr>
   </w:style>
-  <w:style w:type="table" w:styleId="124">
+  <w:style w:type="table" w:styleId="815">
     <w:name w:val="Bordered &amp; Lined - Accent"/>
-    <w:basedOn w:val="665"/>
+    <w:basedOn w:val="889"/>
     <w:uiPriority w:val="99"/>
     <w:pPr>
       <w:pBdr/>
@@ -27291,9 +27770,9 @@
       </w:tcPr>
     </w:tblStylePr>
   </w:style>
-  <w:style w:type="table" w:styleId="125">
+  <w:style w:type="table" w:styleId="816">
     <w:name w:val="Bordered &amp; Lined - Accent 1"/>
-    <w:basedOn w:val="665"/>
+    <w:basedOn w:val="889"/>
     <w:uiPriority w:val="99"/>
     <w:pPr>
       <w:pBdr/>
@@ -27535,9 +28014,9 @@
       </w:tcPr>
     </w:tblStylePr>
   </w:style>
-  <w:style w:type="table" w:styleId="126">
+  <w:style w:type="table" w:styleId="817">
     <w:name w:val="Bordered &amp; Lined - Accent 2"/>
-    <w:basedOn w:val="665"/>
+    <w:basedOn w:val="889"/>
     <w:uiPriority w:val="99"/>
     <w:pPr>
       <w:pBdr/>
@@ -27779,9 +28258,9 @@
       </w:tcPr>
     </w:tblStylePr>
   </w:style>
-  <w:style w:type="table" w:styleId="127">
+  <w:style w:type="table" w:styleId="818">
     <w:name w:val="Bordered &amp; Lined - Accent 3"/>
-    <w:basedOn w:val="665"/>
+    <w:basedOn w:val="889"/>
     <w:uiPriority w:val="99"/>
     <w:pPr>
       <w:pBdr/>
@@ -28023,9 +28502,9 @@
       </w:tcPr>
     </w:tblStylePr>
   </w:style>
-  <w:style w:type="table" w:styleId="128">
+  <w:style w:type="table" w:styleId="819">
     <w:name w:val="Bordered &amp; Lined - Accent 4"/>
-    <w:basedOn w:val="665"/>
+    <w:basedOn w:val="889"/>
     <w:uiPriority w:val="99"/>
     <w:pPr>
       <w:pBdr/>
@@ -28267,9 +28746,9 @@
       </w:tcPr>
     </w:tblStylePr>
   </w:style>
-  <w:style w:type="table" w:styleId="129">
+  <w:style w:type="table" w:styleId="820">
     <w:name w:val="Bordered &amp; Lined - Accent 5"/>
-    <w:basedOn w:val="665"/>
+    <w:basedOn w:val="889"/>
     <w:uiPriority w:val="99"/>
     <w:pPr>
       <w:pBdr/>
@@ -28511,9 +28990,9 @@
       </w:tcPr>
     </w:tblStylePr>
   </w:style>
-  <w:style w:type="table" w:styleId="130">
+  <w:style w:type="table" w:styleId="821">
     <w:name w:val="Bordered &amp; Lined - Accent 6"/>
-    <w:basedOn w:val="665"/>
+    <w:basedOn w:val="889"/>
     <w:uiPriority w:val="99"/>
     <w:pPr>
       <w:pBdr/>
@@ -28755,9 +29234,9 @@
       </w:tcPr>
     </w:tblStylePr>
   </w:style>
-  <w:style w:type="table" w:styleId="131">
+  <w:style w:type="table" w:styleId="822">
     <w:name w:val="Bordered"/>
-    <w:basedOn w:val="665"/>
+    <w:basedOn w:val="889"/>
     <w:uiPriority w:val="99"/>
     <w:pPr>
       <w:pBdr/>
@@ -28986,9 +29465,9 @@
       </w:tcPr>
     </w:tblStylePr>
   </w:style>
-  <w:style w:type="table" w:styleId="132">
+  <w:style w:type="table" w:styleId="823">
     <w:name w:val="Bordered - Accent 1"/>
-    <w:basedOn w:val="665"/>
+    <w:basedOn w:val="889"/>
     <w:uiPriority w:val="99"/>
     <w:pPr>
       <w:pBdr/>
@@ -29217,9 +29696,9 @@
       </w:tcPr>
     </w:tblStylePr>
   </w:style>
-  <w:style w:type="table" w:styleId="133">
+  <w:style w:type="table" w:styleId="824">
     <w:name w:val="Bordered - Accent 2"/>
-    <w:basedOn w:val="665"/>
+    <w:basedOn w:val="889"/>
     <w:uiPriority w:val="99"/>
     <w:pPr>
       <w:pBdr/>
@@ -29448,9 +29927,9 @@
       </w:tcPr>
     </w:tblStylePr>
   </w:style>
-  <w:style w:type="table" w:styleId="134">
+  <w:style w:type="table" w:styleId="825">
     <w:name w:val="Bordered - Accent 3"/>
-    <w:basedOn w:val="665"/>
+    <w:basedOn w:val="889"/>
     <w:uiPriority w:val="99"/>
     <w:pPr>
       <w:pBdr/>
@@ -29679,9 +30158,9 @@
       </w:tcPr>
     </w:tblStylePr>
   </w:style>
-  <w:style w:type="table" w:styleId="135">
+  <w:style w:type="table" w:styleId="826">
     <w:name w:val="Bordered - Accent 4"/>
-    <w:basedOn w:val="665"/>
+    <w:basedOn w:val="889"/>
     <w:uiPriority w:val="99"/>
     <w:pPr>
       <w:pBdr/>
@@ -29910,9 +30389,9 @@
       </w:tcPr>
     </w:tblStylePr>
   </w:style>
-  <w:style w:type="table" w:styleId="136">
+  <w:style w:type="table" w:styleId="827">
     <w:name w:val="Bordered - Accent 5"/>
-    <w:basedOn w:val="665"/>
+    <w:basedOn w:val="889"/>
     <w:uiPriority w:val="99"/>
     <w:pPr>
       <w:pBdr/>
@@ -30141,9 +30620,9 @@
       </w:tcPr>
     </w:tblStylePr>
   </w:style>
-  <w:style w:type="table" w:styleId="137">
+  <w:style w:type="table" w:styleId="828">
     <w:name w:val="Bordered - Accent 6"/>
-    <w:basedOn w:val="665"/>
+    <w:basedOn w:val="889"/>
     <w:uiPriority w:val="99"/>
     <w:pPr>
       <w:pBdr/>
@@ -30372,11 +30851,11 @@
       </w:tcPr>
     </w:tblStylePr>
   </w:style>
-  <w:style w:type="paragraph" w:styleId="139">
+  <w:style w:type="paragraph" w:styleId="829">
     <w:name w:val="Heading 1"/>
-    <w:basedOn w:val="664"/>
-    <w:next w:val="664"/>
-    <w:link w:val="150"/>
+    <w:basedOn w:val="888"/>
+    <w:next w:val="888"/>
+    <w:link w:val="839"/>
     <w:uiPriority w:val="9"/>
     <w:qFormat/>
     <w:pPr>
@@ -30394,11 +30873,11 @@
       <w:szCs w:val="40"/>
     </w:rPr>
   </w:style>
-  <w:style w:type="paragraph" w:styleId="140">
+  <w:style w:type="paragraph" w:styleId="830">
     <w:name w:val="Heading 2"/>
-    <w:basedOn w:val="664"/>
-    <w:next w:val="664"/>
-    <w:link w:val="151"/>
+    <w:basedOn w:val="888"/>
+    <w:next w:val="888"/>
+    <w:link w:val="840"/>
     <w:uiPriority w:val="9"/>
     <w:unhideWhenUsed/>
     <w:qFormat/>
@@ -30417,11 +30896,11 @@
       <w:szCs w:val="32"/>
     </w:rPr>
   </w:style>
-  <w:style w:type="paragraph" w:styleId="141">
+  <w:style w:type="paragraph" w:styleId="831">
     <w:name w:val="Heading 3"/>
-    <w:basedOn w:val="664"/>
-    <w:next w:val="664"/>
-    <w:link w:val="152"/>
+    <w:basedOn w:val="888"/>
+    <w:next w:val="888"/>
+    <w:link w:val="841"/>
     <w:uiPriority w:val="9"/>
     <w:unhideWhenUsed/>
     <w:qFormat/>
@@ -30440,11 +30919,11 @@
       <w:szCs w:val="28"/>
     </w:rPr>
   </w:style>
-  <w:style w:type="paragraph" w:styleId="142">
+  <w:style w:type="paragraph" w:styleId="832">
     <w:name w:val="Heading 4"/>
-    <w:basedOn w:val="664"/>
-    <w:next w:val="664"/>
-    <w:link w:val="153"/>
+    <w:basedOn w:val="888"/>
+    <w:next w:val="888"/>
+    <w:link w:val="842"/>
     <w:uiPriority w:val="9"/>
     <w:unhideWhenUsed/>
     <w:qFormat/>
@@ -30463,11 +30942,11 @@
       <w:color w:val="0f4761" w:themeColor="accent1" w:themeShade="BF"/>
     </w:rPr>
   </w:style>
-  <w:style w:type="paragraph" w:styleId="143">
+  <w:style w:type="paragraph" w:styleId="833">
     <w:name w:val="Heading 5"/>
-    <w:basedOn w:val="664"/>
-    <w:next w:val="664"/>
-    <w:link w:val="154"/>
+    <w:basedOn w:val="888"/>
+    <w:next w:val="888"/>
+    <w:link w:val="843"/>
     <w:uiPriority w:val="9"/>
     <w:unhideWhenUsed/>
     <w:qFormat/>
@@ -30484,11 +30963,11 @@
       <w:color w:val="0f4761" w:themeColor="accent1" w:themeShade="BF"/>
     </w:rPr>
   </w:style>
-  <w:style w:type="paragraph" w:styleId="144">
+  <w:style w:type="paragraph" w:styleId="834">
     <w:name w:val="Heading 6"/>
-    <w:basedOn w:val="664"/>
-    <w:next w:val="664"/>
-    <w:link w:val="155"/>
+    <w:basedOn w:val="888"/>
+    <w:next w:val="888"/>
+    <w:link w:val="844"/>
     <w:uiPriority w:val="9"/>
     <w:unhideWhenUsed/>
     <w:qFormat/>
@@ -30507,11 +30986,11 @@
       <w:color w:val="595959" w:themeColor="text1" w:themeTint="A6"/>
     </w:rPr>
   </w:style>
-  <w:style w:type="paragraph" w:styleId="145">
+  <w:style w:type="paragraph" w:styleId="835">
     <w:name w:val="Heading 7"/>
-    <w:basedOn w:val="664"/>
-    <w:next w:val="664"/>
-    <w:link w:val="156"/>
+    <w:basedOn w:val="888"/>
+    <w:next w:val="888"/>
+    <w:link w:val="845"/>
     <w:uiPriority w:val="9"/>
     <w:unhideWhenUsed/>
     <w:qFormat/>
@@ -30528,11 +31007,11 @@
       <w:color w:val="595959" w:themeColor="text1" w:themeTint="A6"/>
     </w:rPr>
   </w:style>
-  <w:style w:type="paragraph" w:styleId="146">
+  <w:style w:type="paragraph" w:styleId="836">
     <w:name w:val="Heading 8"/>
-    <w:basedOn w:val="664"/>
-    <w:next w:val="664"/>
-    <w:link w:val="157"/>
+    <w:basedOn w:val="888"/>
+    <w:next w:val="888"/>
+    <w:link w:val="846"/>
     <w:uiPriority w:val="9"/>
     <w:unhideWhenUsed/>
     <w:qFormat/>
@@ -30551,11 +31030,11 @@
       <w:color w:val="272727" w:themeColor="text1" w:themeTint="D8"/>
     </w:rPr>
   </w:style>
-  <w:style w:type="paragraph" w:styleId="147">
+  <w:style w:type="paragraph" w:styleId="837">
     <w:name w:val="Heading 9"/>
-    <w:basedOn w:val="664"/>
-    <w:next w:val="664"/>
-    <w:link w:val="158"/>
+    <w:basedOn w:val="888"/>
+    <w:next w:val="888"/>
+    <w:link w:val="847"/>
     <w:uiPriority w:val="9"/>
     <w:unhideWhenUsed/>
     <w:qFormat/>
@@ -30574,7 +31053,7 @@
       <w:color w:val="272727" w:themeColor="text1" w:themeTint="D8"/>
     </w:rPr>
   </w:style>
-  <w:style w:type="character" w:styleId="148" w:default="1">
+  <w:style w:type="character" w:styleId="838" w:default="1">
     <w:name w:val="Default Paragraph Font"/>
     <w:uiPriority w:val="1"/>
     <w:semiHidden/>
@@ -30585,10 +31064,10 @@
       <w:ind/>
     </w:pPr>
   </w:style>
-  <w:style w:type="character" w:styleId="150">
+  <w:style w:type="character" w:styleId="839">
     <w:name w:val="Heading 1 Char"/>
-    <w:basedOn w:val="148"/>
-    <w:link w:val="139"/>
+    <w:basedOn w:val="838"/>
+    <w:link w:val="829"/>
     <w:uiPriority w:val="9"/>
     <w:pPr>
       <w:pBdr/>
@@ -30602,10 +31081,10 @@
       <w:szCs w:val="40"/>
     </w:rPr>
   </w:style>
-  <w:style w:type="character" w:styleId="151">
+  <w:style w:type="character" w:styleId="840">
     <w:name w:val="Heading 2 Char"/>
-    <w:basedOn w:val="148"/>
-    <w:link w:val="140"/>
+    <w:basedOn w:val="838"/>
+    <w:link w:val="830"/>
     <w:uiPriority w:val="9"/>
     <w:pPr>
       <w:pBdr/>
@@ -30619,10 +31098,10 @@
       <w:szCs w:val="32"/>
     </w:rPr>
   </w:style>
-  <w:style w:type="character" w:styleId="152">
+  <w:style w:type="character" w:styleId="841">
     <w:name w:val="Heading 3 Char"/>
-    <w:basedOn w:val="148"/>
-    <w:link w:val="141"/>
+    <w:basedOn w:val="838"/>
+    <w:link w:val="831"/>
     <w:uiPriority w:val="9"/>
     <w:pPr>
       <w:pBdr/>
@@ -30636,10 +31115,10 @@
       <w:szCs w:val="28"/>
     </w:rPr>
   </w:style>
-  <w:style w:type="character" w:styleId="153">
+  <w:style w:type="character" w:styleId="842">
     <w:name w:val="Heading 4 Char"/>
-    <w:basedOn w:val="148"/>
-    <w:link w:val="142"/>
+    <w:basedOn w:val="838"/>
+    <w:link w:val="832"/>
     <w:uiPriority w:val="9"/>
     <w:pPr>
       <w:pBdr/>
@@ -30653,10 +31132,10 @@
       <w:color w:val="0f4761" w:themeColor="accent1" w:themeShade="BF"/>
     </w:rPr>
   </w:style>
-  <w:style w:type="character" w:styleId="154">
+  <w:style w:type="character" w:styleId="843">
     <w:name w:val="Heading 5 Char"/>
-    <w:basedOn w:val="148"/>
-    <w:link w:val="143"/>
+    <w:basedOn w:val="838"/>
+    <w:link w:val="833"/>
     <w:uiPriority w:val="9"/>
     <w:pPr>
       <w:pBdr/>
@@ -30668,10 +31147,10 @@
       <w:color w:val="0f4761" w:themeColor="accent1" w:themeShade="BF"/>
     </w:rPr>
   </w:style>
-  <w:style w:type="character" w:styleId="155">
+  <w:style w:type="character" w:styleId="844">
     <w:name w:val="Heading 6 Char"/>
-    <w:basedOn w:val="148"/>
-    <w:link w:val="144"/>
+    <w:basedOn w:val="838"/>
+    <w:link w:val="834"/>
     <w:uiPriority w:val="9"/>
     <w:pPr>
       <w:pBdr/>
@@ -30685,10 +31164,10 @@
       <w:color w:val="595959" w:themeColor="text1" w:themeTint="A6"/>
     </w:rPr>
   </w:style>
-  <w:style w:type="character" w:styleId="156">
+  <w:style w:type="character" w:styleId="845">
     <w:name w:val="Heading 7 Char"/>
-    <w:basedOn w:val="148"/>
-    <w:link w:val="145"/>
+    <w:basedOn w:val="838"/>
+    <w:link w:val="835"/>
     <w:uiPriority w:val="9"/>
     <w:pPr>
       <w:pBdr/>
@@ -30700,10 +31179,10 @@
       <w:color w:val="595959" w:themeColor="text1" w:themeTint="A6"/>
     </w:rPr>
   </w:style>
-  <w:style w:type="character" w:styleId="157">
+  <w:style w:type="character" w:styleId="846">
     <w:name w:val="Heading 8 Char"/>
-    <w:basedOn w:val="148"/>
-    <w:link w:val="146"/>
+    <w:basedOn w:val="838"/>
+    <w:link w:val="836"/>
     <w:uiPriority w:val="9"/>
     <w:pPr>
       <w:pBdr/>
@@ -30717,10 +31196,10 @@
       <w:color w:val="272727" w:themeColor="text1" w:themeTint="D8"/>
     </w:rPr>
   </w:style>
-  <w:style w:type="character" w:styleId="158">
+  <w:style w:type="character" w:styleId="847">
     <w:name w:val="Heading 9 Char"/>
-    <w:basedOn w:val="148"/>
-    <w:link w:val="147"/>
+    <w:basedOn w:val="838"/>
+    <w:link w:val="837"/>
     <w:uiPriority w:val="9"/>
     <w:pPr>
       <w:pBdr/>
@@ -30734,11 +31213,11 @@
       <w:color w:val="272727" w:themeColor="text1" w:themeTint="D8"/>
     </w:rPr>
   </w:style>
-  <w:style w:type="paragraph" w:styleId="159">
+  <w:style w:type="paragraph" w:styleId="848">
     <w:name w:val="Title"/>
-    <w:basedOn w:val="664"/>
-    <w:next w:val="664"/>
-    <w:link w:val="160"/>
+    <w:basedOn w:val="888"/>
+    <w:next w:val="888"/>
+    <w:link w:val="849"/>
     <w:uiPriority w:val="10"/>
     <w:qFormat/>
     <w:pPr>
@@ -30754,10 +31233,10 @@
       <w:szCs w:val="56"/>
     </w:rPr>
   </w:style>
-  <w:style w:type="character" w:styleId="160">
+  <w:style w:type="character" w:styleId="849">
     <w:name w:val="Title Char"/>
-    <w:basedOn w:val="148"/>
-    <w:link w:val="159"/>
+    <w:basedOn w:val="838"/>
+    <w:link w:val="848"/>
     <w:uiPriority w:val="10"/>
     <w:pPr>
       <w:pBdr/>
@@ -30771,11 +31250,11 @@
       <w:szCs w:val="56"/>
     </w:rPr>
   </w:style>
-  <w:style w:type="paragraph" w:styleId="161">
+  <w:style w:type="paragraph" w:styleId="850">
     <w:name w:val="Subtitle"/>
-    <w:basedOn w:val="664"/>
-    <w:next w:val="664"/>
-    <w:link w:val="162"/>
+    <w:basedOn w:val="888"/>
+    <w:next w:val="888"/>
+    <w:link w:val="851"/>
     <w:uiPriority w:val="11"/>
     <w:qFormat/>
     <w:pPr>
@@ -30793,10 +31272,10 @@
       <w:szCs w:val="28"/>
     </w:rPr>
   </w:style>
-  <w:style w:type="character" w:styleId="162">
+  <w:style w:type="character" w:styleId="851">
     <w:name w:val="Subtitle Char"/>
-    <w:basedOn w:val="148"/>
-    <w:link w:val="161"/>
+    <w:basedOn w:val="838"/>
+    <w:link w:val="850"/>
     <w:uiPriority w:val="11"/>
     <w:pPr>
       <w:pBdr/>
@@ -30810,11 +31289,11 @@
       <w:szCs w:val="28"/>
     </w:rPr>
   </w:style>
-  <w:style w:type="paragraph" w:styleId="163">
+  <w:style w:type="paragraph" w:styleId="852">
     <w:name w:val="Quote"/>
-    <w:basedOn w:val="664"/>
-    <w:next w:val="664"/>
-    <w:link w:val="164"/>
+    <w:basedOn w:val="888"/>
+    <w:next w:val="888"/>
+    <w:link w:val="853"/>
     <w:uiPriority w:val="29"/>
     <w:qFormat/>
     <w:pPr>
@@ -30829,10 +31308,10 @@
       <w:color w:val="404040" w:themeColor="text1" w:themeTint="BF"/>
     </w:rPr>
   </w:style>
-  <w:style w:type="character" w:styleId="164">
+  <w:style w:type="character" w:styleId="853">
     <w:name w:val="Quote Char"/>
-    <w:basedOn w:val="148"/>
-    <w:link w:val="163"/>
+    <w:basedOn w:val="838"/>
+    <w:link w:val="852"/>
     <w:uiPriority w:val="29"/>
     <w:pPr>
       <w:pBdr/>
@@ -30845,9 +31324,9 @@
       <w:color w:val="404040" w:themeColor="text1" w:themeTint="BF"/>
     </w:rPr>
   </w:style>
-  <w:style w:type="character" w:styleId="166">
+  <w:style w:type="character" w:styleId="854">
     <w:name w:val="Intense Emphasis"/>
-    <w:basedOn w:val="148"/>
+    <w:basedOn w:val="838"/>
     <w:uiPriority w:val="21"/>
     <w:qFormat/>
     <w:pPr>
@@ -30861,11 +31340,11 @@
       <w:color w:val="0f4761" w:themeColor="accent1" w:themeShade="BF"/>
     </w:rPr>
   </w:style>
-  <w:style w:type="paragraph" w:styleId="167">
+  <w:style w:type="paragraph" w:styleId="855">
     <w:name w:val="Intense Quote"/>
-    <w:basedOn w:val="664"/>
-    <w:next w:val="664"/>
-    <w:link w:val="168"/>
+    <w:basedOn w:val="888"/>
+    <w:next w:val="888"/>
+    <w:link w:val="856"/>
     <w:uiPriority w:val="30"/>
     <w:qFormat/>
     <w:pPr>
@@ -30883,10 +31362,10 @@
       <w:color w:val="0f4761" w:themeColor="accent1" w:themeShade="BF"/>
     </w:rPr>
   </w:style>
-  <w:style w:type="character" w:styleId="168">
+  <w:style w:type="character" w:styleId="856">
     <w:name w:val="Intense Quote Char"/>
-    <w:basedOn w:val="148"/>
-    <w:link w:val="167"/>
+    <w:basedOn w:val="838"/>
+    <w:link w:val="855"/>
     <w:uiPriority w:val="30"/>
     <w:pPr>
       <w:pBdr/>
@@ -30899,9 +31378,9 @@
       <w:color w:val="0f4761" w:themeColor="accent1" w:themeShade="BF"/>
     </w:rPr>
   </w:style>
-  <w:style w:type="character" w:styleId="169">
+  <w:style w:type="character" w:styleId="857">
     <w:name w:val="Intense Reference"/>
-    <w:basedOn w:val="148"/>
+    <w:basedOn w:val="838"/>
     <w:uiPriority w:val="32"/>
     <w:qFormat/>
     <w:pPr>
@@ -30917,9 +31396,9 @@
       <w:spacing w:val="5"/>
     </w:rPr>
   </w:style>
-  <w:style w:type="character" w:styleId="171">
+  <w:style w:type="character" w:styleId="858">
     <w:name w:val="Subtle Emphasis"/>
-    <w:basedOn w:val="148"/>
+    <w:basedOn w:val="838"/>
     <w:uiPriority w:val="19"/>
     <w:qFormat/>
     <w:pPr>
@@ -30933,9 +31412,9 @@
       <w:color w:val="404040" w:themeColor="text1" w:themeTint="BF"/>
     </w:rPr>
   </w:style>
-  <w:style w:type="character" w:styleId="172">
+  <w:style w:type="character" w:styleId="859">
     <w:name w:val="Emphasis"/>
-    <w:basedOn w:val="148"/>
+    <w:basedOn w:val="838"/>
     <w:uiPriority w:val="20"/>
     <w:qFormat/>
     <w:pPr>
@@ -30948,9 +31427,9 @@
       <w:iCs/>
     </w:rPr>
   </w:style>
-  <w:style w:type="character" w:styleId="173">
+  <w:style w:type="character" w:styleId="860">
     <w:name w:val="Strong"/>
-    <w:basedOn w:val="148"/>
+    <w:basedOn w:val="838"/>
     <w:uiPriority w:val="22"/>
     <w:qFormat/>
     <w:pPr>
@@ -30963,9 +31442,9 @@
       <w:bCs/>
     </w:rPr>
   </w:style>
-  <w:style w:type="character" w:styleId="174">
+  <w:style w:type="character" w:styleId="861">
     <w:name w:val="Subtle Reference"/>
-    <w:basedOn w:val="148"/>
+    <w:basedOn w:val="838"/>
     <w:uiPriority w:val="31"/>
     <w:qFormat/>
     <w:pPr>
@@ -30978,9 +31457,9 @@
       <w:color w:val="5a5a5a" w:themeColor="text1" w:themeTint="A5"/>
     </w:rPr>
   </w:style>
-  <w:style w:type="character" w:styleId="175">
+  <w:style w:type="character" w:styleId="862">
     <w:name w:val="Book Title"/>
-    <w:basedOn w:val="148"/>
+    <w:basedOn w:val="838"/>
     <w:uiPriority w:val="33"/>
     <w:qFormat/>
     <w:pPr>
@@ -30996,10 +31475,10 @@
       <w:spacing w:val="5"/>
     </w:rPr>
   </w:style>
-  <w:style w:type="paragraph" w:styleId="176">
+  <w:style w:type="paragraph" w:styleId="863">
     <w:name w:val="Header"/>
-    <w:basedOn w:val="664"/>
-    <w:link w:val="177"/>
+    <w:basedOn w:val="888"/>
+    <w:link w:val="864"/>
     <w:uiPriority w:val="99"/>
     <w:unhideWhenUsed/>
     <w:pPr>
@@ -31012,10 +31491,10 @@
       <w:ind/>
     </w:pPr>
   </w:style>
-  <w:style w:type="character" w:styleId="177">
+  <w:style w:type="character" w:styleId="864">
     <w:name w:val="Header Char"/>
-    <w:basedOn w:val="148"/>
-    <w:link w:val="176"/>
+    <w:basedOn w:val="838"/>
+    <w:link w:val="863"/>
     <w:uiPriority w:val="99"/>
     <w:pPr>
       <w:pBdr/>
@@ -31023,10 +31502,10 @@
       <w:ind/>
     </w:pPr>
   </w:style>
-  <w:style w:type="paragraph" w:styleId="178">
+  <w:style w:type="paragraph" w:styleId="865">
     <w:name w:val="Footer"/>
-    <w:basedOn w:val="664"/>
-    <w:link w:val="179"/>
+    <w:basedOn w:val="888"/>
+    <w:link w:val="866"/>
     <w:uiPriority w:val="99"/>
     <w:unhideWhenUsed/>
     <w:pPr>
@@ -31039,10 +31518,10 @@
       <w:ind/>
     </w:pPr>
   </w:style>
-  <w:style w:type="character" w:styleId="179">
+  <w:style w:type="character" w:styleId="866">
     <w:name w:val="Footer Char"/>
-    <w:basedOn w:val="148"/>
-    <w:link w:val="178"/>
+    <w:basedOn w:val="838"/>
+    <w:link w:val="865"/>
     <w:uiPriority w:val="99"/>
     <w:pPr>
       <w:pBdr/>
@@ -31050,10 +31529,10 @@
       <w:ind/>
     </w:pPr>
   </w:style>
-  <w:style w:type="paragraph" w:styleId="180">
+  <w:style w:type="paragraph" w:styleId="867">
     <w:name w:val="Caption"/>
-    <w:basedOn w:val="664"/>
-    <w:next w:val="664"/>
+    <w:basedOn w:val="888"/>
+    <w:next w:val="888"/>
     <w:uiPriority w:val="35"/>
     <w:unhideWhenUsed/>
     <w:qFormat/>
@@ -31070,10 +31549,10 @@
       <w:szCs w:val="18"/>
     </w:rPr>
   </w:style>
-  <w:style w:type="paragraph" w:styleId="181">
+  <w:style w:type="paragraph" w:styleId="868">
     <w:name w:val="footnote text"/>
-    <w:basedOn w:val="664"/>
-    <w:link w:val="182"/>
+    <w:basedOn w:val="888"/>
+    <w:link w:val="869"/>
     <w:uiPriority w:val="99"/>
     <w:semiHidden/>
     <w:unhideWhenUsed/>
@@ -31087,10 +31566,10 @@
       <w:szCs w:val="20"/>
     </w:rPr>
   </w:style>
-  <w:style w:type="character" w:styleId="182">
+  <w:style w:type="character" w:styleId="869">
     <w:name w:val="Footnote Text Char"/>
-    <w:basedOn w:val="148"/>
-    <w:link w:val="181"/>
+    <w:basedOn w:val="838"/>
+    <w:link w:val="868"/>
     <w:uiPriority w:val="99"/>
     <w:semiHidden/>
     <w:pPr>
@@ -31103,9 +31582,9 @@
       <w:szCs w:val="20"/>
     </w:rPr>
   </w:style>
-  <w:style w:type="character" w:styleId="183">
+  <w:style w:type="character" w:styleId="870">
     <w:name w:val="footnote reference"/>
-    <w:basedOn w:val="148"/>
+    <w:basedOn w:val="838"/>
     <w:uiPriority w:val="99"/>
     <w:semiHidden/>
     <w:unhideWhenUsed/>
@@ -31118,10 +31597,10 @@
       <w:vertAlign w:val="superscript"/>
     </w:rPr>
   </w:style>
-  <w:style w:type="paragraph" w:styleId="184">
+  <w:style w:type="paragraph" w:styleId="871">
     <w:name w:val="endnote text"/>
-    <w:basedOn w:val="664"/>
-    <w:link w:val="185"/>
+    <w:basedOn w:val="888"/>
+    <w:link w:val="872"/>
     <w:uiPriority w:val="99"/>
     <w:semiHidden/>
     <w:unhideWhenUsed/>
@@ -31135,10 +31614,10 @@
       <w:szCs w:val="20"/>
     </w:rPr>
   </w:style>
-  <w:style w:type="character" w:styleId="185">
+  <w:style w:type="character" w:styleId="872">
     <w:name w:val="Endnote Text Char"/>
-    <w:basedOn w:val="148"/>
-    <w:link w:val="184"/>
+    <w:basedOn w:val="838"/>
+    <w:link w:val="871"/>
     <w:uiPriority w:val="99"/>
     <w:semiHidden/>
     <w:pPr>
@@ -31151,9 +31630,9 @@
       <w:szCs w:val="20"/>
     </w:rPr>
   </w:style>
-  <w:style w:type="character" w:styleId="186">
+  <w:style w:type="character" w:styleId="873">
     <w:name w:val="endnote reference"/>
-    <w:basedOn w:val="148"/>
+    <w:basedOn w:val="838"/>
     <w:uiPriority w:val="99"/>
     <w:semiHidden/>
     <w:unhideWhenUsed/>
@@ -31166,9 +31645,9 @@
       <w:vertAlign w:val="superscript"/>
     </w:rPr>
   </w:style>
-  <w:style w:type="character" w:styleId="187">
+  <w:style w:type="character" w:styleId="874">
     <w:name w:val="Hyperlink"/>
-    <w:basedOn w:val="148"/>
+    <w:basedOn w:val="838"/>
     <w:uiPriority w:val="99"/>
     <w:unhideWhenUsed/>
     <w:pPr>
@@ -31181,9 +31660,9 @@
       <w:u w:val="single"/>
     </w:rPr>
   </w:style>
-  <w:style w:type="character" w:styleId="188">
+  <w:style w:type="character" w:styleId="875">
     <w:name w:val="FollowedHyperlink"/>
-    <w:basedOn w:val="148"/>
+    <w:basedOn w:val="838"/>
     <w:uiPriority w:val="99"/>
     <w:semiHidden/>
     <w:unhideWhenUsed/>
@@ -31197,10 +31676,10 @@
       <w:u w:val="single"/>
     </w:rPr>
   </w:style>
-  <w:style w:type="paragraph" w:styleId="189">
+  <w:style w:type="paragraph" w:styleId="876">
     <w:name w:val="toc 1"/>
-    <w:basedOn w:val="664"/>
-    <w:next w:val="664"/>
+    <w:basedOn w:val="888"/>
+    <w:next w:val="888"/>
     <w:uiPriority w:val="39"/>
     <w:unhideWhenUsed/>
     <w:pPr>
@@ -31209,10 +31688,10 @@
       <w:ind/>
     </w:pPr>
   </w:style>
-  <w:style w:type="paragraph" w:styleId="190">
+  <w:style w:type="paragraph" w:styleId="877">
     <w:name w:val="toc 2"/>
-    <w:basedOn w:val="664"/>
-    <w:next w:val="664"/>
+    <w:basedOn w:val="888"/>
+    <w:next w:val="888"/>
     <w:uiPriority w:val="39"/>
     <w:unhideWhenUsed/>
     <w:pPr>
@@ -31221,10 +31700,10 @@
       <w:ind w:left="220"/>
     </w:pPr>
   </w:style>
-  <w:style w:type="paragraph" w:styleId="191">
+  <w:style w:type="paragraph" w:styleId="878">
     <w:name w:val="toc 3"/>
-    <w:basedOn w:val="664"/>
-    <w:next w:val="664"/>
+    <w:basedOn w:val="888"/>
+    <w:next w:val="888"/>
     <w:uiPriority w:val="39"/>
     <w:unhideWhenUsed/>
     <w:pPr>
@@ -31233,10 +31712,10 @@
       <w:ind w:left="440"/>
     </w:pPr>
   </w:style>
-  <w:style w:type="paragraph" w:styleId="192">
+  <w:style w:type="paragraph" w:styleId="879">
     <w:name w:val="toc 4"/>
-    <w:basedOn w:val="664"/>
-    <w:next w:val="664"/>
+    <w:basedOn w:val="888"/>
+    <w:next w:val="888"/>
     <w:uiPriority w:val="39"/>
     <w:unhideWhenUsed/>
     <w:pPr>
@@ -31245,10 +31724,10 @@
       <w:ind w:left="660"/>
     </w:pPr>
   </w:style>
-  <w:style w:type="paragraph" w:styleId="193">
+  <w:style w:type="paragraph" w:styleId="880">
     <w:name w:val="toc 5"/>
-    <w:basedOn w:val="664"/>
-    <w:next w:val="664"/>
+    <w:basedOn w:val="888"/>
+    <w:next w:val="888"/>
     <w:uiPriority w:val="39"/>
     <w:unhideWhenUsed/>
     <w:pPr>
@@ -31257,10 +31736,10 @@
       <w:ind w:left="880"/>
     </w:pPr>
   </w:style>
-  <w:style w:type="paragraph" w:styleId="194">
+  <w:style w:type="paragraph" w:styleId="881">
     <w:name w:val="toc 6"/>
-    <w:basedOn w:val="664"/>
-    <w:next w:val="664"/>
+    <w:basedOn w:val="888"/>
+    <w:next w:val="888"/>
     <w:uiPriority w:val="39"/>
     <w:unhideWhenUsed/>
     <w:pPr>
@@ -31269,10 +31748,10 @@
       <w:ind w:left="1100"/>
     </w:pPr>
   </w:style>
-  <w:style w:type="paragraph" w:styleId="195">
+  <w:style w:type="paragraph" w:styleId="882">
     <w:name w:val="toc 7"/>
-    <w:basedOn w:val="664"/>
-    <w:next w:val="664"/>
+    <w:basedOn w:val="888"/>
+    <w:next w:val="888"/>
     <w:uiPriority w:val="39"/>
     <w:unhideWhenUsed/>
     <w:pPr>
@@ -31281,10 +31760,10 @@
       <w:ind w:left="1320"/>
     </w:pPr>
   </w:style>
-  <w:style w:type="paragraph" w:styleId="196">
+  <w:style w:type="paragraph" w:styleId="883">
     <w:name w:val="toc 8"/>
-    <w:basedOn w:val="664"/>
-    <w:next w:val="664"/>
+    <w:basedOn w:val="888"/>
+    <w:next w:val="888"/>
     <w:uiPriority w:val="39"/>
     <w:unhideWhenUsed/>
     <w:pPr>
@@ -31293,10 +31772,10 @@
       <w:ind w:left="1540"/>
     </w:pPr>
   </w:style>
-  <w:style w:type="paragraph" w:styleId="197">
+  <w:style w:type="paragraph" w:styleId="884">
     <w:name w:val="toc 9"/>
-    <w:basedOn w:val="664"/>
-    <w:next w:val="664"/>
+    <w:basedOn w:val="888"/>
+    <w:next w:val="888"/>
     <w:uiPriority w:val="39"/>
     <w:unhideWhenUsed/>
     <w:pPr>
@@ -31305,9 +31784,9 @@
       <w:ind w:left="1760"/>
     </w:pPr>
   </w:style>
-  <w:style w:type="character" w:styleId="198">
+  <w:style w:type="character" w:styleId="885">
     <w:name w:val="Placeholder Text"/>
-    <w:basedOn w:val="148"/>
+    <w:basedOn w:val="838"/>
     <w:uiPriority w:val="99"/>
     <w:semiHidden/>
     <w:pPr>
@@ -31319,7 +31798,7 @@
       <w:color w:val="666666"/>
     </w:rPr>
   </w:style>
-  <w:style w:type="paragraph" w:styleId="208">
+  <w:style w:type="paragraph" w:styleId="886">
     <w:name w:val="TOC Heading"/>
     <w:uiPriority w:val="39"/>
     <w:unhideWhenUsed/>
@@ -31329,10 +31808,10 @@
       <w:ind/>
     </w:pPr>
   </w:style>
-  <w:style w:type="paragraph" w:styleId="209">
+  <w:style w:type="paragraph" w:styleId="887">
     <w:name w:val="table of figures"/>
-    <w:basedOn w:val="664"/>
-    <w:next w:val="664"/>
+    <w:basedOn w:val="888"/>
+    <w:next w:val="888"/>
     <w:uiPriority w:val="99"/>
     <w:unhideWhenUsed/>
     <w:pPr>
@@ -31341,7 +31820,7 @@
       <w:ind/>
     </w:pPr>
   </w:style>
-  <w:style w:type="paragraph" w:styleId="664" w:default="1">
+  <w:style w:type="paragraph" w:styleId="888" w:default="1">
     <w:name w:val="Normal"/>
     <w:qFormat/>
     <w:pPr>
@@ -31350,7 +31829,7 @@
       <w:ind/>
     </w:pPr>
   </w:style>
-  <w:style w:type="table" w:styleId="665" w:default="1">
+  <w:style w:type="table" w:styleId="889" w:default="1">
     <w:name w:val="Normal Table"/>
     <w:uiPriority w:val="99"/>
     <w:semiHidden/>
@@ -31543,7 +32022,7 @@
       </w:tcPr>
     </w:tblStylePr>
   </w:style>
-  <w:style w:type="numbering" w:styleId="666" w:default="1">
+  <w:style w:type="numbering" w:styleId="890" w:default="1">
     <w:name w:val="No List"/>
     <w:uiPriority w:val="99"/>
     <w:semiHidden/>
@@ -31554,9 +32033,9 @@
       <w:ind/>
     </w:pPr>
   </w:style>
-  <w:style w:type="paragraph" w:styleId="667">
+  <w:style w:type="paragraph" w:styleId="891">
     <w:name w:val="No Spacing"/>
-    <w:basedOn w:val="664"/>
+    <w:basedOn w:val="888"/>
     <w:uiPriority w:val="1"/>
     <w:qFormat/>
     <w:pPr>
@@ -31565,9 +32044,9 @@
       <w:ind/>
     </w:pPr>
   </w:style>
-  <w:style w:type="paragraph" w:styleId="668">
+  <w:style w:type="paragraph" w:styleId="892">
     <w:name w:val="List Paragraph"/>
-    <w:basedOn w:val="664"/>
+    <w:basedOn w:val="888"/>
     <w:uiPriority w:val="34"/>
     <w:qFormat/>
     <w:pPr>

</xml_diff>